<commit_message>
added Mapping files resulted from PCT_reserve_mapping python script
</commit_message>
<xml_diff>
--- a/v0.3 DB_Observation_notes.docx
+++ b/v0.3 DB_Observation_notes.docx
@@ -3,11 +3,6 @@
 <w:document xmlns:wpc="http://schemas.microsoft.com/office/word/2010/wordprocessingCanvas" xmlns:cx="http://schemas.microsoft.com/office/drawing/2014/chartex" xmlns:cx1="http://schemas.microsoft.com/office/drawing/2015/9/8/chartex" xmlns:cx2="http://schemas.microsoft.com/office/drawing/2015/10/21/chartex" xmlns:cx3="http://schemas.microsoft.com/office/drawing/2016/5/9/chartex" xmlns:cx4="http://schemas.microsoft.com/office/drawing/2016/5/10/chartex" xmlns:cx5="http://schemas.microsoft.com/office/drawing/2016/5/11/chartex" xmlns:cx6="http://schemas.microsoft.com/office/drawing/2016/5/12/chartex" xmlns:cx7="http://schemas.microsoft.com/office/drawing/2016/5/13/chartex" xmlns:cx8="http://schemas.microsoft.com/office/drawing/2016/5/14/chartex" xmlns:mc="http://schemas.openxmlformats.org/markup-compatibility/2006" xmlns:aink="http://schemas.microsoft.com/office/drawing/2016/ink" xmlns:am3d="http://schemas.microsoft.com/office/drawing/2017/model3d" xmlns:o="urn:schemas-microsoft-com:office:office" xmlns:oel="http://schemas.microsoft.com/office/2019/extlst" xmlns:r="http://schemas.openxmlformats.org/officeDocument/2006/relationships" xmlns:m="http://schemas.openxmlformats.org/officeDocument/2006/math" xmlns:v="urn:schemas-microsoft-com:vml" xmlns:wp14="http://schemas.microsoft.com/office/word/2010/wordprocessingDrawing" xmlns:wp="http://schemas.openxmlformats.org/drawingml/2006/wordprocessingDrawing" xmlns:w10="urn:schemas-microsoft-com:office:word" xmlns:w="http://schemas.openxmlformats.org/wordprocessingml/2006/main" xmlns:w14="http://schemas.microsoft.com/office/word/2010/wordml" xmlns:w15="http://schemas.microsoft.com/office/word/2012/wordml" xmlns:w16cex="http://schemas.microsoft.com/office/word/2018/wordml/cex" xmlns:w16cid="http://schemas.microsoft.com/office/word/2016/wordml/cid" xmlns:w16="http://schemas.microsoft.com/office/word/2018/wordml" xmlns:w16du="http://schemas.microsoft.com/office/word/2023/wordml/word16du" xmlns:w16sdtdh="http://schemas.microsoft.com/office/word/2020/wordml/sdtdatahash" xmlns:w16sdtfl="http://schemas.microsoft.com/office/word/2024/wordml/sdtformatlock" xmlns:w16se="http://schemas.microsoft.com/office/word/2015/wordml/symex" xmlns:wpg="http://schemas.microsoft.com/office/word/2010/wordprocessingGroup" xmlns:wpi="http://schemas.microsoft.com/office/word/2010/wordprocessingInk" xmlns:wne="http://schemas.microsoft.com/office/word/2006/wordml" xmlns:wps="http://schemas.microsoft.com/office/word/2010/wordprocessingShape" mc:Ignorable="w14 w15 w16se w16cid w16 w16cex w16sdtdh w16sdtfl w16du wp14">
   <w:body>
     <w:p>
-      <w:pPr>
-        <w:rPr>
-          <w:rFonts w:hint="eastAsia"/>
-        </w:rPr>
-      </w:pPr>
       <w:r>
         <w:rPr>
           <w:rFonts w:hint="eastAsia"/>
@@ -53,15 +48,7 @@
     </w:p>
     <w:p>
       <w:r>
-        <w:t>Username: flora-</w:t>
-      </w:r>
-      <w:proofErr w:type="spellStart"/>
-      <w:r>
-        <w:t>admin_flora</w:t>
-      </w:r>
-      <w:proofErr w:type="spellEnd"/>
-      <w:r>
-        <w:t>-admin</w:t>
+        <w:t>Username: flora-admin_flora-admin</w:t>
       </w:r>
     </w:p>
     <w:p>
@@ -119,21 +106,7 @@
         <w:rPr>
           <w:rFonts w:hint="eastAsia"/>
         </w:rPr>
-        <w:t xml:space="preserve"> file is in </w:t>
-      </w:r>
-      <w:proofErr w:type="spellStart"/>
-      <w:r>
-        <w:rPr>
-          <w:rFonts w:hint="eastAsia"/>
-        </w:rPr>
-        <w:t>Github</w:t>
-      </w:r>
-      <w:proofErr w:type="spellEnd"/>
-      <w:r>
-        <w:rPr>
-          <w:rFonts w:hint="eastAsia"/>
-        </w:rPr>
-        <w:t xml:space="preserve"> with a new sheet)</w:t>
+        <w:t xml:space="preserve"> file is in Github with a new sheet)</w:t>
       </w:r>
     </w:p>
     <w:p>
@@ -185,13 +158,7 @@
         <w:t>)</w:t>
       </w:r>
     </w:p>
-    <w:p>
-      <w:pPr>
-        <w:rPr>
-          <w:rFonts w:hint="eastAsia"/>
-        </w:rPr>
-      </w:pPr>
-    </w:p>
+    <w:p/>
     <w:p>
       <w:r>
         <w:t xml:space="preserve">Tested </w:t>
@@ -222,15 +189,7 @@
     <w:p/>
     <w:p>
       <w:r>
-        <w:t xml:space="preserve">Imported the </w:t>
-      </w:r>
-      <w:proofErr w:type="spellStart"/>
-      <w:r>
-        <w:t>sql</w:t>
-      </w:r>
-      <w:proofErr w:type="spellEnd"/>
-      <w:r>
-        <w:t xml:space="preserve"> files</w:t>
+        <w:t>Imported the sql files</w:t>
       </w:r>
       <w:r>
         <w:rPr>
@@ -239,13 +198,8 @@
         <w:t xml:space="preserve"> from Python code (processed </w:t>
       </w:r>
       <w:r>
-        <w:t>ALA-</w:t>
-      </w:r>
-      <w:proofErr w:type="spellStart"/>
-      <w:r>
-        <w:t>LansdowneSouth</w:t>
-      </w:r>
-      <w:proofErr w:type="spellEnd"/>
+        <w:t>ALA-LansdowneSouth</w:t>
+      </w:r>
       <w:r>
         <w:rPr>
           <w:rFonts w:hint="eastAsia"/>
@@ -274,21 +228,7 @@
         <w:rPr>
           <w:rFonts w:hint="eastAsia"/>
         </w:rPr>
-        <w:t xml:space="preserve">I think </w:t>
-      </w:r>
-      <w:proofErr w:type="gramStart"/>
-      <w:r>
-        <w:rPr>
-          <w:rFonts w:hint="eastAsia"/>
-        </w:rPr>
-        <w:t>as long as</w:t>
-      </w:r>
-      <w:proofErr w:type="gramEnd"/>
-      <w:r>
-        <w:rPr>
-          <w:rFonts w:hint="eastAsia"/>
-        </w:rPr>
-        <w:t xml:space="preserve"> we preprocess the dataset well, should be all good)</w:t>
+        <w:t>I think as long as we preprocess the dataset well, should be all good)</w:t>
       </w:r>
     </w:p>
     <w:p/>
@@ -379,23 +319,10 @@
         <w:rPr>
           <w:rFonts w:hint="eastAsia"/>
         </w:rPr>
-        <w:t xml:space="preserve">added into the </w:t>
-      </w:r>
-      <w:proofErr w:type="spellStart"/>
-      <w:r>
-        <w:rPr>
-          <w:rFonts w:hint="eastAsia"/>
-        </w:rPr>
-        <w:t>db</w:t>
-      </w:r>
-      <w:proofErr w:type="spellEnd"/>
-    </w:p>
-    <w:p>
-      <w:pPr>
-        <w:rPr>
-          <w:rFonts w:hint="eastAsia"/>
-        </w:rPr>
-      </w:pPr>
+        <w:t>added into the db</w:t>
+      </w:r>
+    </w:p>
+    <w:p>
       <w:r>
         <w:t>S</w:t>
       </w:r>
@@ -429,97 +356,31 @@
       <w:r>
         <w:br/>
       </w:r>
-      <w:proofErr w:type="spellStart"/>
       <w:r>
         <w:t>mySQL_occurrences_Garrison_test</w:t>
       </w:r>
-      <w:proofErr w:type="spellEnd"/>
-      <w:r>
-        <w:rPr>
-          <w:rFonts w:hint="eastAsia"/>
-        </w:rPr>
-        <w:t xml:space="preserve"> file can handle both </w:t>
-      </w:r>
-      <w:proofErr w:type="spellStart"/>
-      <w:r>
-        <w:rPr>
-          <w:rFonts w:hint="eastAsia"/>
-        </w:rPr>
-        <w:t>xlsx&amp;csv</w:t>
-      </w:r>
-      <w:proofErr w:type="spellEnd"/>
-      <w:r>
-        <w:rPr>
-          <w:rFonts w:hint="eastAsia"/>
-        </w:rPr>
-        <w:t xml:space="preserve"> files which mean that we can use both ALA-</w:t>
-      </w:r>
-      <w:proofErr w:type="spellStart"/>
-      <w:r>
-        <w:rPr>
-          <w:rFonts w:hint="eastAsia"/>
-        </w:rPr>
-        <w:t>LansdowneSouth</w:t>
-      </w:r>
-      <w:proofErr w:type="spellEnd"/>
-      <w:r>
-        <w:rPr>
-          <w:rFonts w:hint="eastAsia"/>
-        </w:rPr>
-        <w:t xml:space="preserve"> &amp; Garrison files to convert them into SQL files.</w:t>
-      </w:r>
-    </w:p>
-    <w:p>
-      <w:pPr>
-        <w:rPr>
-          <w:rFonts w:hint="eastAsia"/>
-        </w:rPr>
-      </w:pPr>
-    </w:p>
-    <w:p>
-      <w:proofErr w:type="spellStart"/>
-      <w:proofErr w:type="gramStart"/>
-      <w:r>
-        <w:rPr>
-          <w:rFonts w:hint="eastAsia"/>
-        </w:rPr>
-        <w:t>species.scientific</w:t>
-      </w:r>
-      <w:proofErr w:type="gramEnd"/>
-      <w:r>
-        <w:rPr>
-          <w:rFonts w:hint="eastAsia"/>
-        </w:rPr>
-        <w:t>_name</w:t>
-      </w:r>
-      <w:proofErr w:type="spellEnd"/>
-      <w:r>
-        <w:rPr>
-          <w:rFonts w:hint="eastAsia"/>
-        </w:rPr>
-        <w:t xml:space="preserve"> columns are set to be UNIQUE as there were duplicated columns. </w:t>
-      </w:r>
-    </w:p>
-    <w:p>
-      <w:r>
-        <w:rPr>
-          <w:rFonts w:hint="eastAsia"/>
-        </w:rPr>
-        <w:t>Previous rows are all discarded and imported ALA-</w:t>
-      </w:r>
-      <w:proofErr w:type="spellStart"/>
-      <w:r>
-        <w:rPr>
-          <w:rFonts w:hint="eastAsia"/>
-        </w:rPr>
-        <w:t>LansdowneSouth</w:t>
-      </w:r>
-      <w:proofErr w:type="spellEnd"/>
-      <w:r>
-        <w:rPr>
-          <w:rFonts w:hint="eastAsia"/>
-        </w:rPr>
-        <w:t xml:space="preserve"> &amp; Garrison again</w:t>
+      <w:r>
+        <w:rPr>
+          <w:rFonts w:hint="eastAsia"/>
+        </w:rPr>
+        <w:t xml:space="preserve"> file can handle both xlsx&amp;csv files which mean that we can use both ALA-LansdowneSouth &amp; Garrison files to convert them into SQL files.</w:t>
+      </w:r>
+    </w:p>
+    <w:p/>
+    <w:p>
+      <w:r>
+        <w:rPr>
+          <w:rFonts w:hint="eastAsia"/>
+        </w:rPr>
+        <w:t xml:space="preserve">species.scientific_name columns are set to be UNIQUE as there were duplicated columns. </w:t>
+      </w:r>
+    </w:p>
+    <w:p>
+      <w:r>
+        <w:rPr>
+          <w:rFonts w:hint="eastAsia"/>
+        </w:rPr>
+        <w:t>Previous rows are all discarded and imported ALA-LansdowneSouth &amp; Garrison again</w:t>
       </w:r>
       <w:r>
         <w:rPr>
@@ -542,11 +403,9 @@
       <w:r>
         <w:t>“</w:t>
       </w:r>
-      <w:proofErr w:type="spellStart"/>
       <w:r>
         <w:t>mySQL_occurrences_Garrison_test</w:t>
       </w:r>
-      <w:proofErr w:type="spellEnd"/>
       <w:r>
         <w:t>”</w:t>
       </w:r>
@@ -616,23 +475,15 @@
         <w:t>‘</w:t>
       </w:r>
       <w:r>
-        <w:t>PCTS-Cameron-</w:t>
-      </w:r>
-      <w:proofErr w:type="spellStart"/>
-      <w:r>
-        <w:t>ShapeFiles</w:t>
+        <w:t>PCTS-Cameron-ShapeFiles</w:t>
       </w:r>
       <w:r>
         <w:t>’</w:t>
       </w:r>
-      <w:proofErr w:type="spellEnd"/>
     </w:p>
     <w:p>
       <w:pPr>
         <w:ind w:firstLine="800"/>
-        <w:rPr>
-          <w:rFonts w:hint="eastAsia"/>
-        </w:rPr>
       </w:pPr>
       <w:r>
         <w:rPr>
@@ -656,35 +507,7 @@
         <w:rPr>
           <w:rFonts w:hint="eastAsia"/>
         </w:rPr>
-        <w:t xml:space="preserve">ct &amp; reserve tables do not store polygons itself. It only stores result from spatial </w:t>
-      </w:r>
-      <w:proofErr w:type="gramStart"/>
-      <w:r>
-        <w:rPr>
-          <w:rFonts w:hint="eastAsia"/>
-        </w:rPr>
-        <w:t>join</w:t>
-      </w:r>
-      <w:proofErr w:type="gramEnd"/>
-      <w:r>
-        <w:rPr>
-          <w:rFonts w:hint="eastAsia"/>
-        </w:rPr>
-        <w:t xml:space="preserve"> and the shapefiles </w:t>
-      </w:r>
-      <w:proofErr w:type="gramStart"/>
-      <w:r>
-        <w:rPr>
-          <w:rFonts w:hint="eastAsia"/>
-        </w:rPr>
-        <w:t>have to</w:t>
-      </w:r>
-      <w:proofErr w:type="gramEnd"/>
-      <w:r>
-        <w:rPr>
-          <w:rFonts w:hint="eastAsia"/>
-        </w:rPr>
-        <w:t xml:space="preserve"> be kept for further modification</w:t>
+        <w:t>ct &amp; reserve tables do not store polygons itself. It only stores result from spatial join and the shapefiles have to be kept for further modification</w:t>
       </w:r>
     </w:p>
     <w:p>
@@ -720,53 +543,8 @@
         <w:br/>
       </w:r>
       <w:r>
-        <w:t xml:space="preserve">pip install pandas </w:t>
-      </w:r>
-      <w:proofErr w:type="spellStart"/>
-      <w:r>
-        <w:t>geopandas</w:t>
-      </w:r>
-      <w:proofErr w:type="spellEnd"/>
-      <w:r>
-        <w:t xml:space="preserve"> shapely </w:t>
-      </w:r>
-      <w:proofErr w:type="spellStart"/>
-      <w:r>
-        <w:t>sqlalchemy</w:t>
-      </w:r>
-      <w:proofErr w:type="spellEnd"/>
-      <w:r>
-        <w:t xml:space="preserve"> </w:t>
-      </w:r>
-      <w:proofErr w:type="spellStart"/>
-      <w:r>
-        <w:t>pymysql</w:t>
-      </w:r>
-      <w:proofErr w:type="spellEnd"/>
-      <w:r>
-        <w:t xml:space="preserve"> </w:t>
-      </w:r>
-      <w:proofErr w:type="spellStart"/>
-      <w:r>
-        <w:t>fiona</w:t>
-      </w:r>
-      <w:proofErr w:type="spellEnd"/>
-      <w:r>
-        <w:t xml:space="preserve"> </w:t>
-      </w:r>
-      <w:proofErr w:type="spellStart"/>
-      <w:r>
-        <w:t>pyproj</w:t>
-      </w:r>
-      <w:proofErr w:type="spellEnd"/>
-      <w:r>
-        <w:t xml:space="preserve"> </w:t>
-      </w:r>
-      <w:proofErr w:type="spellStart"/>
-      <w:r>
-        <w:t>rtree</w:t>
-      </w:r>
-      <w:proofErr w:type="spellEnd"/>
+        <w:t>pip install pandas geopandas shapely sqlalchemy pymysql fiona pyproj rtree</w:t>
+      </w:r>
     </w:p>
     <w:p>
       <w:pPr>
@@ -775,26 +553,15 @@
           <w:ilvl w:val="0"/>
           <w:numId w:val="2"/>
         </w:numPr>
-        <w:rPr>
-          <w:rFonts w:hint="eastAsia"/>
-        </w:rPr>
-      </w:pPr>
-    </w:p>
-    <w:p>
-      <w:r>
-        <w:rPr>
-          <w:rFonts w:hint="eastAsia"/>
-        </w:rPr>
-        <w:t xml:space="preserve">Left side is shapefile, and the right side is the </w:t>
-      </w:r>
-      <w:proofErr w:type="spellStart"/>
-      <w:r>
-        <w:rPr>
-          <w:rFonts w:hint="eastAsia"/>
-        </w:rPr>
-        <w:t>db</w:t>
-      </w:r>
-      <w:proofErr w:type="spellEnd"/>
+      </w:pPr>
+    </w:p>
+    <w:p>
+      <w:r>
+        <w:rPr>
+          <w:rFonts w:hint="eastAsia"/>
+        </w:rPr>
+        <w:t>Left side is shapefile, and the right side is the db</w:t>
+      </w:r>
       <w:r>
         <w:br/>
       </w:r>
@@ -802,16 +569,8 @@
         <w:rPr>
           <w:rFonts w:hint="eastAsia"/>
         </w:rPr>
-        <w:t xml:space="preserve">ASSET_NAME -&gt; </w:t>
-      </w:r>
-      <w:proofErr w:type="spellStart"/>
-      <w:r>
-        <w:rPr>
-          <w:rFonts w:hint="eastAsia"/>
-        </w:rPr>
-        <w:t>asset_name</w:t>
-      </w:r>
-      <w:proofErr w:type="spellEnd"/>
+        <w:t>ASSET_NAME -&gt; asset_name</w:t>
+      </w:r>
     </w:p>
     <w:p>
       <w:r>
@@ -826,32 +585,16 @@
         <w:rPr>
           <w:rFonts w:hint="eastAsia"/>
         </w:rPr>
-        <w:t xml:space="preserve">ASSET_TYPE -&gt; </w:t>
-      </w:r>
-      <w:proofErr w:type="spellStart"/>
-      <w:r>
-        <w:rPr>
-          <w:rFonts w:hint="eastAsia"/>
-        </w:rPr>
-        <w:t>asset_type</w:t>
-      </w:r>
-      <w:proofErr w:type="spellEnd"/>
-    </w:p>
-    <w:p>
-      <w:r>
-        <w:rPr>
-          <w:rFonts w:hint="eastAsia"/>
-        </w:rPr>
-        <w:t xml:space="preserve">ASSET_CLAS -&gt; </w:t>
-      </w:r>
-      <w:proofErr w:type="spellStart"/>
-      <w:r>
-        <w:rPr>
-          <w:rFonts w:hint="eastAsia"/>
-        </w:rPr>
-        <w:t>asset_class</w:t>
-      </w:r>
-      <w:proofErr w:type="spellEnd"/>
+        <w:t>ASSET_TYPE -&gt; asset_type</w:t>
+      </w:r>
+    </w:p>
+    <w:p>
+      <w:r>
+        <w:rPr>
+          <w:rFonts w:hint="eastAsia"/>
+        </w:rPr>
+        <w:t>ASSET_CLAS -&gt; asset_class</w:t>
+      </w:r>
     </w:p>
     <w:p/>
     <w:p>
@@ -860,79 +603,31 @@
           <w:rFonts w:hint="eastAsia"/>
         </w:rPr>
         <w:lastRenderedPageBreak/>
-        <w:t xml:space="preserve">PCTID -&gt; </w:t>
-      </w:r>
-      <w:proofErr w:type="spellStart"/>
-      <w:r>
-        <w:rPr>
-          <w:rFonts w:hint="eastAsia"/>
-        </w:rPr>
-        <w:t>pct_code</w:t>
-      </w:r>
-      <w:proofErr w:type="spellEnd"/>
-    </w:p>
-    <w:p>
-      <w:proofErr w:type="spellStart"/>
-      <w:r>
-        <w:rPr>
-          <w:rFonts w:hint="eastAsia"/>
-        </w:rPr>
-        <w:t>PCTName</w:t>
-      </w:r>
-      <w:proofErr w:type="spellEnd"/>
-      <w:r>
-        <w:rPr>
-          <w:rFonts w:hint="eastAsia"/>
-        </w:rPr>
-        <w:t xml:space="preserve"> -&gt; </w:t>
-      </w:r>
-      <w:proofErr w:type="spellStart"/>
-      <w:r>
-        <w:rPr>
-          <w:rFonts w:hint="eastAsia"/>
-        </w:rPr>
-        <w:t>pct_name</w:t>
-      </w:r>
-      <w:proofErr w:type="spellEnd"/>
-    </w:p>
-    <w:p>
-      <w:proofErr w:type="spellStart"/>
-      <w:r>
-        <w:rPr>
-          <w:rFonts w:hint="eastAsia"/>
-        </w:rPr>
-        <w:t>vegForm</w:t>
-      </w:r>
-      <w:proofErr w:type="spellEnd"/>
-      <w:r>
-        <w:rPr>
-          <w:rFonts w:hint="eastAsia"/>
-        </w:rPr>
-        <w:t xml:space="preserve"> -&gt; </w:t>
-      </w:r>
-      <w:proofErr w:type="spellStart"/>
-      <w:r>
-        <w:rPr>
-          <w:rFonts w:hint="eastAsia"/>
-        </w:rPr>
-        <w:t>vegetation_form</w:t>
-      </w:r>
-      <w:proofErr w:type="spellEnd"/>
-    </w:p>
-    <w:p>
-      <w:proofErr w:type="spellStart"/>
-      <w:r>
-        <w:rPr>
-          <w:rFonts w:hint="eastAsia"/>
-        </w:rPr>
-        <w:t>form_pct</w:t>
-      </w:r>
-      <w:proofErr w:type="spellEnd"/>
-      <w:r>
-        <w:rPr>
-          <w:rFonts w:hint="eastAsia"/>
-        </w:rPr>
-        <w:t xml:space="preserve">? </w:t>
+        <w:t>PCTID -&gt; pct_code</w:t>
+      </w:r>
+    </w:p>
+    <w:p>
+      <w:r>
+        <w:rPr>
+          <w:rFonts w:hint="eastAsia"/>
+        </w:rPr>
+        <w:t>PCTName -&gt; pct_name</w:t>
+      </w:r>
+    </w:p>
+    <w:p>
+      <w:r>
+        <w:rPr>
+          <w:rFonts w:hint="eastAsia"/>
+        </w:rPr>
+        <w:t>vegForm -&gt; vegetation_form</w:t>
+      </w:r>
+    </w:p>
+    <w:p>
+      <w:r>
+        <w:rPr>
+          <w:rFonts w:hint="eastAsia"/>
+        </w:rPr>
+        <w:t xml:space="preserve">form_pct? </w:t>
       </w:r>
       <w:r>
         <w:t>N</w:t>
@@ -964,14 +659,12 @@
       <w:r>
         <w:t>‘</w:t>
       </w:r>
-      <w:proofErr w:type="spellStart"/>
       <w:r>
         <w:rPr>
           <w:rFonts w:hint="eastAsia"/>
         </w:rPr>
         <w:t>occurrences_mapping_temp</w:t>
       </w:r>
-      <w:proofErr w:type="spellEnd"/>
       <w:r>
         <w:t>’</w:t>
       </w:r>
@@ -979,44 +672,8 @@
         <w:rPr>
           <w:rFonts w:hint="eastAsia"/>
         </w:rPr>
-        <w:t xml:space="preserve"> to liaise </w:t>
-      </w:r>
-      <w:proofErr w:type="spellStart"/>
-      <w:r>
-        <w:rPr>
-          <w:rFonts w:hint="eastAsia"/>
-        </w:rPr>
-        <w:t>occurrence_id</w:t>
-      </w:r>
-      <w:proofErr w:type="spellEnd"/>
-      <w:r>
-        <w:rPr>
-          <w:rFonts w:hint="eastAsia"/>
-        </w:rPr>
-        <w:t xml:space="preserve">, </w:t>
-      </w:r>
-      <w:proofErr w:type="spellStart"/>
-      <w:r>
-        <w:rPr>
-          <w:rFonts w:hint="eastAsia"/>
-        </w:rPr>
-        <w:t>reserve_id</w:t>
-      </w:r>
-      <w:proofErr w:type="spellEnd"/>
-      <w:r>
-        <w:rPr>
-          <w:rFonts w:hint="eastAsia"/>
-        </w:rPr>
-        <w:t xml:space="preserve">, and </w:t>
-      </w:r>
-      <w:proofErr w:type="spellStart"/>
-      <w:r>
-        <w:rPr>
-          <w:rFonts w:hint="eastAsia"/>
-        </w:rPr>
-        <w:t>pct_id</w:t>
-      </w:r>
-      <w:proofErr w:type="spellEnd"/>
+        <w:t xml:space="preserve"> to liaise occurrence_id, reserve_id, and pct_id</w:t>
+      </w:r>
       <w:r>
         <w:br/>
       </w:r>
@@ -1086,16 +743,8 @@
         <w:rPr>
           <w:rFonts w:hint="eastAsia"/>
         </w:rPr>
-        <w:t xml:space="preserve">When importing to </w:t>
-      </w:r>
-      <w:proofErr w:type="spellStart"/>
-      <w:r>
-        <w:rPr>
-          <w:rFonts w:hint="eastAsia"/>
-        </w:rPr>
-        <w:t>db</w:t>
-      </w:r>
-      <w:proofErr w:type="spellEnd"/>
+        <w:t>When importing to db</w:t>
+      </w:r>
       <w:r>
         <w:rPr>
           <w:rFonts w:hint="eastAsia"/>
@@ -1143,303 +792,159 @@
           <w:b/>
           <w:bCs/>
         </w:rPr>
-        <w:t xml:space="preserve">Steps to map occurrences &amp; </w:t>
-      </w:r>
-      <w:proofErr w:type="spellStart"/>
+        <w:t>Steps to map occurrences &amp; pcts/reserves:</w:t>
+      </w:r>
+      <w:r>
+        <w:br/>
+      </w:r>
+      <w:r>
+        <w:rPr>
+          <w:rFonts w:hint="eastAsia"/>
+        </w:rPr>
+        <w:t xml:space="preserve">1. </w:t>
+      </w:r>
+      <w:r>
+        <w:t>R</w:t>
+      </w:r>
+      <w:r>
+        <w:rPr>
+          <w:rFonts w:hint="eastAsia"/>
+        </w:rPr>
+        <w:t xml:space="preserve">un </w:t>
+      </w:r>
+      <w:r>
+        <w:t>PCT_reserve_mapping</w:t>
+      </w:r>
+      <w:r>
+        <w:rPr>
+          <w:rFonts w:hint="eastAsia"/>
+        </w:rPr>
+        <w:t>.py</w:t>
+      </w:r>
+    </w:p>
+    <w:p>
+      <w:r>
+        <w:rPr>
+          <w:rFonts w:hint="eastAsia"/>
+        </w:rPr>
+        <w:t xml:space="preserve">-&gt; This file use input </w:t>
+      </w:r>
+      <w:r>
+        <w:t>‘</w:t>
+      </w:r>
+      <w:r>
+        <w:rPr>
+          <w:rFonts w:hint="eastAsia"/>
+        </w:rPr>
+        <w:t>occurrences.csv / reserve shapefile / pct shapefile</w:t>
+      </w:r>
+      <w:r>
+        <w:t>’</w:t>
+      </w:r>
+    </w:p>
+    <w:p>
+      <w:r>
+        <w:rPr>
+          <w:rFonts w:hint="eastAsia"/>
+        </w:rPr>
+        <w:t>-&gt; Python GeoPandas handles coordinates</w:t>
+      </w:r>
+    </w:p>
+    <w:p>
+      <w:r>
+        <w:rPr>
+          <w:rFonts w:hint="eastAsia"/>
+        </w:rPr>
+        <w:t>-&gt; output files: reserves_import.csv / pcts_import.csv / occurrence_mapping_temp.csv</w:t>
+      </w:r>
+    </w:p>
+    <w:p>
+      <w:r>
+        <w:rPr>
+          <w:rFonts w:hint="eastAsia"/>
+        </w:rPr>
+        <w:t>-&gt; import them into db / SQL join update (statement below)</w:t>
+      </w:r>
+    </w:p>
+    <w:p>
+      <w:r>
+        <w:rPr>
+          <w:rFonts w:hint="eastAsia"/>
+        </w:rPr>
+        <w:t>2. import Mapping Files / reserves_import.csv &amp; pcts_import.csv</w:t>
+      </w:r>
+    </w:p>
+    <w:p>
+      <w:r>
+        <w:rPr>
+          <w:rFonts w:hint="eastAsia"/>
+        </w:rPr>
+        <w:t xml:space="preserve">3. </w:t>
+      </w:r>
       <w:r>
         <w:rPr>
           <w:rFonts w:hint="eastAsia"/>
           <w:b/>
           <w:bCs/>
         </w:rPr>
-        <w:t>pcts</w:t>
-      </w:r>
-      <w:proofErr w:type="spellEnd"/>
-      <w:r>
-        <w:rPr>
-          <w:rFonts w:hint="eastAsia"/>
-          <w:b/>
-          <w:bCs/>
-        </w:rPr>
-        <w:t>/reserves:</w:t>
+        <w:t>Clean occurrences_mapping_temp table first</w:t>
+      </w:r>
+      <w:r>
+        <w:rPr>
+          <w:rFonts w:hint="eastAsia"/>
+        </w:rPr>
+        <w:t xml:space="preserve">, and </w:t>
+      </w:r>
+      <w:r>
+        <w:rPr>
+          <w:rFonts w:hint="eastAsia"/>
+        </w:rPr>
+        <w:t>import Mapping Files / occurrence_mapping_tem</w:t>
+      </w:r>
+      <w:r>
+        <w:rPr>
+          <w:rFonts w:hint="eastAsia"/>
+        </w:rPr>
+        <w:t>p</w:t>
+      </w:r>
+      <w:r>
+        <w:rPr>
+          <w:rFonts w:hint="eastAsia"/>
+        </w:rPr>
+        <w:t>.csv</w:t>
+      </w:r>
+    </w:p>
+    <w:p>
+      <w:r>
+        <w:rPr>
+          <w:rFonts w:hint="eastAsia"/>
+        </w:rPr>
+        <w:t>4. update occurrences table:</w:t>
+      </w:r>
+    </w:p>
+    <w:p>
+      <w:r>
+        <w:t>UPDATE occurrences o</w:t>
       </w:r>
       <w:r>
         <w:br/>
-      </w:r>
-      <w:r>
-        <w:rPr>
-          <w:rFonts w:hint="eastAsia"/>
-        </w:rPr>
-        <w:t xml:space="preserve">1. </w:t>
-      </w:r>
-      <w:r>
-        <w:t>R</w:t>
-      </w:r>
-      <w:r>
-        <w:rPr>
-          <w:rFonts w:hint="eastAsia"/>
-        </w:rPr>
-        <w:t xml:space="preserve">un </w:t>
-      </w:r>
-      <w:r>
-        <w:t>PCT_reserve_mapping</w:t>
-      </w:r>
-      <w:r>
-        <w:rPr>
-          <w:rFonts w:hint="eastAsia"/>
-        </w:rPr>
-        <w:t>.py</w:t>
-      </w:r>
-    </w:p>
-    <w:p>
-      <w:r>
-        <w:rPr>
-          <w:rFonts w:hint="eastAsia"/>
-        </w:rPr>
-        <w:t xml:space="preserve">-&gt; This file use input </w:t>
-      </w:r>
-      <w:r>
-        <w:t>‘</w:t>
-      </w:r>
-      <w:r>
-        <w:rPr>
-          <w:rFonts w:hint="eastAsia"/>
-        </w:rPr>
-        <w:t>occurrences.csv / reserve shapefile / pct shapefile</w:t>
-      </w:r>
-      <w:r>
-        <w:t>’</w:t>
-      </w:r>
-    </w:p>
-    <w:p>
-      <w:r>
-        <w:rPr>
-          <w:rFonts w:hint="eastAsia"/>
-        </w:rPr>
-        <w:t xml:space="preserve">-&gt; Python </w:t>
-      </w:r>
-      <w:proofErr w:type="spellStart"/>
-      <w:r>
-        <w:rPr>
-          <w:rFonts w:hint="eastAsia"/>
-        </w:rPr>
-        <w:t>GeoPandas</w:t>
-      </w:r>
-      <w:proofErr w:type="spellEnd"/>
-      <w:r>
-        <w:rPr>
-          <w:rFonts w:hint="eastAsia"/>
-        </w:rPr>
-        <w:t xml:space="preserve"> handles coordinates</w:t>
-      </w:r>
-    </w:p>
-    <w:p>
-      <w:r>
-        <w:rPr>
-          <w:rFonts w:hint="eastAsia"/>
-        </w:rPr>
-        <w:t>-&gt; output files: reserves_import.csv / pcts_import.csv / occurrence_mapping_temp.csv</w:t>
-      </w:r>
-    </w:p>
-    <w:p>
-      <w:pPr>
-        <w:rPr>
-          <w:rFonts w:hint="eastAsia"/>
-        </w:rPr>
-      </w:pPr>
-      <w:r>
-        <w:rPr>
-          <w:rFonts w:hint="eastAsia"/>
-        </w:rPr>
-        <w:t xml:space="preserve">-&gt; import them into </w:t>
-      </w:r>
-      <w:proofErr w:type="spellStart"/>
-      <w:r>
-        <w:rPr>
-          <w:rFonts w:hint="eastAsia"/>
-        </w:rPr>
-        <w:t>db</w:t>
-      </w:r>
-      <w:proofErr w:type="spellEnd"/>
-      <w:r>
-        <w:rPr>
-          <w:rFonts w:hint="eastAsia"/>
-        </w:rPr>
-        <w:t xml:space="preserve"> / SQL join update (statement below)</w:t>
-      </w:r>
-    </w:p>
-    <w:p>
-      <w:r>
-        <w:rPr>
-          <w:rFonts w:hint="eastAsia"/>
-        </w:rPr>
-        <w:t>2. import Mapping Files / reserves_import.csv &amp; pcts_import.csv</w:t>
-      </w:r>
-    </w:p>
-    <w:p>
-      <w:r>
-        <w:rPr>
-          <w:rFonts w:hint="eastAsia"/>
-        </w:rPr>
-        <w:t xml:space="preserve">3. </w:t>
-      </w:r>
-      <w:r>
-        <w:rPr>
-          <w:rFonts w:hint="eastAsia"/>
-          <w:b/>
-          <w:bCs/>
-        </w:rPr>
-        <w:t xml:space="preserve">Clean </w:t>
-      </w:r>
-      <w:proofErr w:type="spellStart"/>
-      <w:r>
-        <w:rPr>
-          <w:rFonts w:hint="eastAsia"/>
-          <w:b/>
-          <w:bCs/>
-        </w:rPr>
-        <w:t>occurrences_mapping_temp</w:t>
-      </w:r>
-      <w:proofErr w:type="spellEnd"/>
-      <w:r>
-        <w:rPr>
-          <w:rFonts w:hint="eastAsia"/>
-          <w:b/>
-          <w:bCs/>
-        </w:rPr>
-        <w:t xml:space="preserve"> table first</w:t>
-      </w:r>
-      <w:r>
-        <w:rPr>
-          <w:rFonts w:hint="eastAsia"/>
-        </w:rPr>
-        <w:t xml:space="preserve">, and </w:t>
-      </w:r>
-      <w:r>
-        <w:rPr>
-          <w:rFonts w:hint="eastAsia"/>
-        </w:rPr>
-        <w:t>import Mapping Files / occurrence_mapping_tem</w:t>
-      </w:r>
-      <w:r>
-        <w:rPr>
-          <w:rFonts w:hint="eastAsia"/>
-        </w:rPr>
-        <w:t>p</w:t>
-      </w:r>
-      <w:r>
-        <w:rPr>
-          <w:rFonts w:hint="eastAsia"/>
-        </w:rPr>
-        <w:t>.csv</w:t>
-      </w:r>
-    </w:p>
-    <w:p>
-      <w:r>
-        <w:rPr>
-          <w:rFonts w:hint="eastAsia"/>
-        </w:rPr>
-        <w:t>4. update occurrences table:</w:t>
-      </w:r>
-    </w:p>
-    <w:p>
-      <w:r>
-        <w:t>UPDATE occurrences o</w:t>
+        <w:t>JOIN occurrence_mapping_temp m</w:t>
       </w:r>
       <w:r>
         <w:br/>
-        <w:t xml:space="preserve">JOIN </w:t>
-      </w:r>
-      <w:proofErr w:type="spellStart"/>
-      <w:r>
-        <w:t>occurrence_mapping_temp</w:t>
-      </w:r>
-      <w:proofErr w:type="spellEnd"/>
-      <w:r>
-        <w:t xml:space="preserve"> m</w:t>
+        <w:t>ON o.occurrence_id = m.occurrence_id</w:t>
       </w:r>
       <w:r>
         <w:br/>
-        <w:t xml:space="preserve">ON </w:t>
-      </w:r>
-      <w:proofErr w:type="spellStart"/>
-      <w:proofErr w:type="gramStart"/>
-      <w:r>
-        <w:t>o.occurrence</w:t>
-      </w:r>
-      <w:proofErr w:type="gramEnd"/>
-      <w:r>
-        <w:t>_id</w:t>
-      </w:r>
-      <w:proofErr w:type="spellEnd"/>
-      <w:r>
-        <w:t xml:space="preserve"> = </w:t>
-      </w:r>
-      <w:proofErr w:type="spellStart"/>
-      <w:proofErr w:type="gramStart"/>
-      <w:r>
-        <w:t>m.occurrence</w:t>
-      </w:r>
-      <w:proofErr w:type="gramEnd"/>
-      <w:r>
-        <w:t>_id</w:t>
-      </w:r>
-      <w:proofErr w:type="spellEnd"/>
+        <w:t>SET o.reserve_id = m.reserve_id,</w:t>
+      </w:r>
       <w:r>
         <w:br/>
-        <w:t xml:space="preserve">SET </w:t>
-      </w:r>
-      <w:proofErr w:type="spellStart"/>
-      <w:proofErr w:type="gramStart"/>
-      <w:r>
-        <w:t>o.reserve</w:t>
-      </w:r>
-      <w:proofErr w:type="gramEnd"/>
-      <w:r>
-        <w:t>_id</w:t>
-      </w:r>
-      <w:proofErr w:type="spellEnd"/>
-      <w:r>
-        <w:t xml:space="preserve"> = </w:t>
-      </w:r>
-      <w:proofErr w:type="spellStart"/>
-      <w:proofErr w:type="gramStart"/>
-      <w:r>
-        <w:t>m.reserve</w:t>
-      </w:r>
-      <w:proofErr w:type="gramEnd"/>
-      <w:r>
-        <w:t>_id</w:t>
-      </w:r>
-      <w:proofErr w:type="spellEnd"/>
-      <w:r>
-        <w:t>,</w:t>
-      </w:r>
-      <w:r>
-        <w:br/>
-      </w:r>
-      <w:proofErr w:type="spellStart"/>
+      </w:r>
       <w:r>
         <w:lastRenderedPageBreak/>
-        <w:t>o.pct_id</w:t>
-      </w:r>
-      <w:proofErr w:type="spellEnd"/>
-      <w:r>
-        <w:t xml:space="preserve"> = </w:t>
-      </w:r>
-      <w:proofErr w:type="spellStart"/>
-      <w:r>
-        <w:t>m.pct_</w:t>
-      </w:r>
-      <w:proofErr w:type="gramStart"/>
-      <w:r>
-        <w:t>id</w:t>
-      </w:r>
-      <w:proofErr w:type="spellEnd"/>
-      <w:r>
-        <w:t>;</w:t>
-      </w:r>
-      <w:proofErr w:type="gramEnd"/>
+        <w:t>o.pct_id = m.pct_id;</w:t>
+      </w:r>
     </w:p>
     <w:p/>
     <w:p>
@@ -1467,7 +972,6 @@
           <w:numId w:val="3"/>
         </w:numPr>
       </w:pPr>
-      <w:proofErr w:type="spellStart"/>
       <w:r>
         <w:t>M</w:t>
       </w:r>
@@ -1475,14 +979,7 @@
         <w:rPr>
           <w:rFonts w:hint="eastAsia"/>
         </w:rPr>
-        <w:t>ost_recent_flag</w:t>
-      </w:r>
-      <w:proofErr w:type="spellEnd"/>
-      <w:r>
-        <w:rPr>
-          <w:rFonts w:hint="eastAsia"/>
-        </w:rPr>
-        <w:t xml:space="preserve"> handle (business rule)</w:t>
+        <w:t>ost_recent_flag handle (business rule)</w:t>
       </w:r>
     </w:p>
     <w:p>
@@ -1497,21 +994,7 @@
         <w:rPr>
           <w:rFonts w:hint="eastAsia"/>
         </w:rPr>
-        <w:t xml:space="preserve">Reserve/PCT based summary </w:t>
-      </w:r>
-      <w:proofErr w:type="gramStart"/>
-      <w:r>
-        <w:rPr>
-          <w:rFonts w:hint="eastAsia"/>
-        </w:rPr>
-        <w:t>ex)species</w:t>
-      </w:r>
-      <w:proofErr w:type="gramEnd"/>
-      <w:r>
-        <w:rPr>
-          <w:rFonts w:hint="eastAsia"/>
-        </w:rPr>
-        <w:t xml:space="preserve"> count per reserve / species occurrence counts</w:t>
+        <w:t>Reserve/PCT based summary ex)species count per reserve / species occurrence counts</w:t>
       </w:r>
     </w:p>
     <w:p>
@@ -1521,9 +1004,6 @@
           <w:ilvl w:val="0"/>
           <w:numId w:val="3"/>
         </w:numPr>
-        <w:rPr>
-          <w:rFonts w:hint="eastAsia"/>
-        </w:rPr>
       </w:pPr>
       <w:r>
         <w:rPr>
@@ -1538,48 +1018,67 @@
         <w:rPr>
           <w:rFonts w:hint="eastAsia"/>
         </w:rPr>
-        <w:t xml:space="preserve">est seemed finished. </w:t>
-      </w:r>
-      <w:proofErr w:type="gramStart"/>
-      <w:r>
-        <w:rPr>
-          <w:rFonts w:hint="eastAsia"/>
-        </w:rPr>
-        <w:t>So</w:t>
-      </w:r>
-      <w:proofErr w:type="gramEnd"/>
-      <w:r>
-        <w:rPr>
-          <w:rFonts w:hint="eastAsia"/>
-        </w:rPr>
-        <w:t xml:space="preserve"> I need the actual dataset that we</w:t>
-      </w:r>
-      <w:r>
-        <w:t>’</w:t>
-      </w:r>
-      <w:r>
-        <w:rPr>
-          <w:rFonts w:hint="eastAsia"/>
-        </w:rPr>
-        <w:t xml:space="preserve">re using for the website. Is the dataset from ALA website itself? </w:t>
-      </w:r>
-      <w:proofErr w:type="spellStart"/>
-      <w:r>
-        <w:t>L</w:t>
-      </w:r>
-      <w:r>
-        <w:rPr>
-          <w:rFonts w:hint="eastAsia"/>
-        </w:rPr>
-        <w:t>mk</w:t>
-      </w:r>
-      <w:proofErr w:type="spellEnd"/>
-      <w:r>
-        <w:rPr>
-          <w:rFonts w:hint="eastAsia"/>
-        </w:rPr>
-        <w:t xml:space="preserve"> if someone knows about this</w:t>
-      </w:r>
+        <w:t xml:space="preserve">est seemed finished. So I need </w:t>
+      </w:r>
+      <w:r>
+        <w:rPr>
+          <w:rFonts w:hint="eastAsia"/>
+        </w:rPr>
+        <w:t>all dataset needed for the website.</w:t>
+      </w:r>
+    </w:p>
+    <w:p>
+      <w:pPr>
+        <w:pStyle w:val="ListParagraph"/>
+        <w:numPr>
+          <w:ilvl w:val="0"/>
+          <w:numId w:val="3"/>
+        </w:numPr>
+      </w:pPr>
+      <w:r>
+        <w:rPr>
+          <w:rFonts w:hint="eastAsia"/>
+        </w:rPr>
+        <w:t>Occurrences.data_generalisations? What does this column do?</w:t>
+      </w:r>
+    </w:p>
+    <w:p>
+      <w:pPr>
+        <w:pStyle w:val="ListParagraph"/>
+        <w:numPr>
+          <w:ilvl w:val="0"/>
+          <w:numId w:val="3"/>
+        </w:numPr>
+      </w:pPr>
+      <w:r>
+        <w:rPr>
+          <w:rFonts w:hint="eastAsia"/>
+        </w:rPr>
+        <w:t>Synonyms</w:t>
+      </w:r>
+      <w:r>
+        <w:rPr>
+          <w:rFonts w:hint="eastAsia"/>
+        </w:rPr>
+        <w:t xml:space="preserve"> table</w:t>
+      </w:r>
+      <w:r>
+        <w:rPr>
+          <w:rFonts w:hint="eastAsia"/>
+        </w:rPr>
+        <w:t>. What should we start for this?</w:t>
+      </w:r>
+      <w:r>
+        <w:rPr>
+          <w:rFonts w:hint="eastAsia"/>
+        </w:rPr>
+        <w:t xml:space="preserve"> I have no idea</w:t>
+      </w:r>
+    </w:p>
+    <w:p>
+      <w:pPr>
+        <w:ind w:left="440"/>
+      </w:pPr>
     </w:p>
     <w:sectPr>
       <w:pgSz w:w="11906" w:h="16838"/>
@@ -2528,6 +2027,7 @@
   <w:style w:type="character" w:default="1" w:styleId="DefaultParagraphFont">
     <w:name w:val="Default Paragraph Font"/>
     <w:uiPriority w:val="1"/>
+    <w:semiHidden/>
     <w:unhideWhenUsed/>
   </w:style>
   <w:style w:type="table" w:default="1" w:styleId="TableNormal">

</xml_diff>

<commit_message>
Updated the db with updated python scripts and csv files exported from the db. Still needs an update, so refer to the documentation
</commit_message>
<xml_diff>
--- a/v0.3 DB_Observation_notes.docx
+++ b/v0.3 DB_Observation_notes.docx
@@ -1079,6 +1079,1022 @@
       <w:pPr>
         <w:ind w:left="440"/>
       </w:pPr>
+      <w:r>
+        <w:br/>
+      </w:r>
+      <w:r>
+        <w:br/>
+      </w:r>
+    </w:p>
+    <w:p>
+      <w:pPr>
+        <w:widowControl/>
+        <w:wordWrap/>
+        <w:autoSpaceDE/>
+        <w:autoSpaceDN/>
+      </w:pPr>
+      <w:r>
+        <w:br w:type="page"/>
+      </w:r>
+    </w:p>
+    <w:p>
+      <w:pPr>
+        <w:rPr>
+          <w:b/>
+          <w:bCs/>
+          <w:highlight w:val="yellow"/>
+        </w:rPr>
+      </w:pPr>
+      <w:r>
+        <w:rPr>
+          <w:rFonts w:hint="eastAsia"/>
+        </w:rPr>
+        <w:lastRenderedPageBreak/>
+        <w:t>-</w:t>
+      </w:r>
+      <w:r>
+        <w:rPr>
+          <w:rFonts w:hint="eastAsia"/>
+        </w:rPr>
+        <w:t>26</w:t>
+      </w:r>
+      <w:r>
+        <w:rPr>
+          <w:rFonts w:hint="eastAsia"/>
+        </w:rPr>
+        <w:t>/04/2026 Weekly update</w:t>
+      </w:r>
+      <w:r>
+        <w:br/>
+      </w:r>
+      <w:r>
+        <w:rPr>
+          <w:rFonts w:hint="eastAsia"/>
+          <w:b/>
+          <w:bCs/>
+          <w:highlight w:val="yellow"/>
+        </w:rPr>
+        <w:t>How does mapping file (</w:t>
+      </w:r>
+      <w:r>
+        <w:rPr>
+          <w:b/>
+          <w:bCs/>
+          <w:highlight w:val="yellow"/>
+        </w:rPr>
+        <w:t>PCT_reserve_mapping</w:t>
+      </w:r>
+      <w:r>
+        <w:rPr>
+          <w:rFonts w:hint="eastAsia"/>
+          <w:b/>
+          <w:bCs/>
+          <w:highlight w:val="yellow"/>
+        </w:rPr>
+        <w:t>) works?</w:t>
+      </w:r>
+      <w:r>
+        <w:rPr>
+          <w:b/>
+          <w:bCs/>
+          <w:highlight w:val="yellow"/>
+        </w:rPr>
+        <w:br/>
+      </w:r>
+      <w:r>
+        <w:rPr>
+          <w:rFonts w:hint="eastAsia"/>
+          <w:b/>
+          <w:bCs/>
+          <w:highlight w:val="yellow"/>
+        </w:rPr>
+        <w:t xml:space="preserve">- </w:t>
+      </w:r>
+      <w:r>
+        <w:rPr>
+          <w:rFonts w:hint="eastAsia"/>
+          <w:b/>
+          <w:bCs/>
+          <w:highlight w:val="yellow"/>
+        </w:rPr>
+        <w:t xml:space="preserve">read occurrences.csv (from the db export) and creates </w:t>
+      </w:r>
+      <w:r>
+        <w:rPr>
+          <w:b/>
+          <w:bCs/>
+          <w:highlight w:val="yellow"/>
+        </w:rPr>
+        <w:t>arbitrary</w:t>
+      </w:r>
+      <w:r>
+        <w:rPr>
+          <w:rFonts w:hint="eastAsia"/>
+          <w:b/>
+          <w:bCs/>
+          <w:highlight w:val="yellow"/>
+        </w:rPr>
+        <w:t xml:space="preserve"> pin points</w:t>
+      </w:r>
+      <w:r>
+        <w:rPr>
+          <w:b/>
+          <w:bCs/>
+          <w:highlight w:val="yellow"/>
+        </w:rPr>
+        <w:br/>
+      </w:r>
+      <w:r>
+        <w:rPr>
+          <w:rFonts w:hint="eastAsia"/>
+          <w:b/>
+          <w:bCs/>
+          <w:highlight w:val="yellow"/>
+        </w:rPr>
+        <w:t>- read shapefiles to have the polygons for pins</w:t>
+      </w:r>
+      <w:r>
+        <w:rPr>
+          <w:b/>
+          <w:bCs/>
+          <w:highlight w:val="yellow"/>
+        </w:rPr>
+        <w:br/>
+      </w:r>
+      <w:r>
+        <w:rPr>
+          <w:rFonts w:hint="eastAsia"/>
+          <w:b/>
+          <w:bCs/>
+          <w:highlight w:val="yellow"/>
+        </w:rPr>
+        <w:t xml:space="preserve">- geopandas.sjoin assigns </w:t>
+      </w:r>
+      <w:r>
+        <w:rPr>
+          <w:rFonts w:hint="eastAsia"/>
+          <w:b/>
+          <w:bCs/>
+          <w:highlight w:val="yellow"/>
+        </w:rPr>
+        <w:t>a polygon</w:t>
+      </w:r>
+      <w:r>
+        <w:rPr>
+          <w:rFonts w:hint="eastAsia"/>
+          <w:b/>
+          <w:bCs/>
+          <w:highlight w:val="yellow"/>
+        </w:rPr>
+        <w:t xml:space="preserve"> for each pin points</w:t>
+      </w:r>
+      <w:r>
+        <w:rPr>
+          <w:b/>
+          <w:bCs/>
+          <w:highlight w:val="yellow"/>
+        </w:rPr>
+        <w:br/>
+      </w:r>
+      <w:r>
+        <w:rPr>
+          <w:rFonts w:hint="eastAsia"/>
+          <w:b/>
+          <w:bCs/>
+          <w:highlight w:val="yellow"/>
+        </w:rPr>
+        <w:t>- than converts rows into reserve_id or pct_id</w:t>
+      </w:r>
+      <w:r>
+        <w:rPr>
+          <w:b/>
+          <w:bCs/>
+          <w:highlight w:val="yellow"/>
+        </w:rPr>
+        <w:br/>
+      </w:r>
+      <w:r>
+        <w:rPr>
+          <w:rFonts w:hint="eastAsia"/>
+          <w:b/>
+          <w:bCs/>
+          <w:highlight w:val="yellow"/>
+        </w:rPr>
+        <w:t>- finally occurrences_id / reserves_id / pct_id will come out as a result</w:t>
+      </w:r>
+    </w:p>
+    <w:p>
+      <w:pPr>
+        <w:rPr>
+          <w:rFonts w:hint="eastAsia"/>
+          <w:b/>
+          <w:bCs/>
+        </w:rPr>
+      </w:pPr>
+      <w:r>
+        <w:rPr>
+          <w:rFonts w:hint="eastAsia"/>
+          <w:b/>
+          <w:bCs/>
+          <w:highlight w:val="yellow"/>
+        </w:rPr>
+        <w:t xml:space="preserve">- import this result to the db table </w:t>
+      </w:r>
+      <w:r>
+        <w:rPr>
+          <w:b/>
+          <w:bCs/>
+          <w:highlight w:val="yellow"/>
+        </w:rPr>
+        <w:t>‘</w:t>
+      </w:r>
+      <w:r>
+        <w:rPr>
+          <w:rFonts w:hint="eastAsia"/>
+          <w:b/>
+          <w:bCs/>
+          <w:highlight w:val="yellow"/>
+        </w:rPr>
+        <w:t>occurrence_mapping_temp</w:t>
+      </w:r>
+      <w:r>
+        <w:rPr>
+          <w:b/>
+          <w:bCs/>
+          <w:highlight w:val="yellow"/>
+        </w:rPr>
+        <w:t>’</w:t>
+      </w:r>
+      <w:r>
+        <w:rPr>
+          <w:rFonts w:hint="eastAsia"/>
+          <w:b/>
+          <w:bCs/>
+          <w:highlight w:val="yellow"/>
+        </w:rPr>
+        <w:t xml:space="preserve"> and conduct a simple sql statement in the db to update the occurrences table</w:t>
+      </w:r>
+    </w:p>
+    <w:p>
+      <w:r>
+        <w:rPr>
+          <w:rFonts w:hint="eastAsia"/>
+        </w:rPr>
+        <w:t xml:space="preserve">-Confirmed that </w:t>
+      </w:r>
+      <w:r>
+        <w:rPr>
+          <w:rFonts w:hint="eastAsia"/>
+        </w:rPr>
+        <w:t>some</w:t>
+      </w:r>
+      <w:r>
+        <w:rPr>
+          <w:rFonts w:hint="eastAsia"/>
+        </w:rPr>
+        <w:t xml:space="preserve"> table</w:t>
+      </w:r>
+      <w:r>
+        <w:rPr>
+          <w:rFonts w:hint="eastAsia"/>
+        </w:rPr>
+        <w:t>s</w:t>
+      </w:r>
+      <w:r>
+        <w:rPr>
+          <w:rFonts w:hint="eastAsia"/>
+        </w:rPr>
+        <w:t xml:space="preserve"> need</w:t>
+      </w:r>
+      <w:r>
+        <w:rPr>
+          <w:rFonts w:hint="eastAsia"/>
+        </w:rPr>
+        <w:t xml:space="preserve"> </w:t>
+      </w:r>
+      <w:r>
+        <w:rPr>
+          <w:rFonts w:hint="eastAsia"/>
+        </w:rPr>
+        <w:t>update</w:t>
+      </w:r>
+      <w:r>
+        <w:rPr>
+          <w:rFonts w:hint="eastAsia"/>
+        </w:rPr>
+        <w:t>s</w:t>
+      </w:r>
+    </w:p>
+    <w:p>
+      <w:pPr>
+        <w:rPr>
+          <w:rFonts w:hint="eastAsia"/>
+        </w:rPr>
+      </w:pPr>
+      <w:r>
+        <w:rPr>
+          <w:rFonts w:hint="eastAsia"/>
+        </w:rPr>
+        <w:t>1. Separate suburb &amp; location</w:t>
+      </w:r>
+      <w:r>
+        <w:rPr>
+          <w:rFonts w:hint="eastAsia"/>
+        </w:rPr>
+        <w:t xml:space="preserve"> as Dorothy asked</w:t>
+      </w:r>
+    </w:p>
+    <w:p>
+      <w:r>
+        <w:rPr>
+          <w:rFonts w:hint="eastAsia"/>
+        </w:rPr>
+        <w:t>2. Add</w:t>
+      </w:r>
+      <w:r>
+        <w:rPr>
+          <w:rFonts w:hint="eastAsia"/>
+        </w:rPr>
+        <w:t>ed</w:t>
+      </w:r>
+      <w:r>
+        <w:rPr>
+          <w:rFonts w:hint="eastAsia"/>
+        </w:rPr>
+        <w:t xml:space="preserve"> </w:t>
+      </w:r>
+      <w:r>
+        <w:rPr>
+          <w:rFonts w:hint="eastAsia"/>
+        </w:rPr>
+        <w:t>reserves.</w:t>
+      </w:r>
+      <w:r>
+        <w:rPr>
+          <w:rFonts w:hint="eastAsia"/>
+        </w:rPr>
+        <w:t>asset_sub_type attribute</w:t>
+      </w:r>
+    </w:p>
+    <w:p>
+      <w:pPr>
+        <w:rPr>
+          <w:rFonts w:hint="eastAsia"/>
+        </w:rPr>
+      </w:pPr>
+      <w:r>
+        <w:rPr>
+          <w:rFonts w:hint="eastAsia"/>
+        </w:rPr>
+        <w:t>3. pcts.form_pct attribute now have valid data</w:t>
+      </w:r>
+    </w:p>
+    <w:p>
+      <w:pPr>
+        <w:rPr>
+          <w:lang w:val="en-US"/>
+        </w:rPr>
+      </w:pPr>
+      <w:r>
+        <w:br/>
+      </w:r>
+      <w:r>
+        <w:rPr>
+          <w:rFonts w:hint="eastAsia"/>
+        </w:rPr>
+        <w:t>Added new columns in reserves table:</w:t>
+      </w:r>
+      <w:r>
+        <w:br/>
+      </w:r>
+      <w:r>
+        <w:rPr>
+          <w:rFonts w:hint="eastAsia"/>
+        </w:rPr>
+        <w:t>- suburb</w:t>
+      </w:r>
+      <w:r>
+        <w:br/>
+      </w:r>
+      <w:r>
+        <w:rPr>
+          <w:rFonts w:hint="eastAsia"/>
+        </w:rPr>
+        <w:t>- asset_sub_type</w:t>
+      </w:r>
+      <w:r>
+        <w:br/>
+      </w:r>
+      <w:r>
+        <w:br/>
+      </w:r>
+      <w:r>
+        <w:rPr>
+          <w:rFonts w:hint="eastAsia"/>
+        </w:rPr>
+        <w:t xml:space="preserve">Modified python script </w:t>
+      </w:r>
+      <w:r>
+        <w:t>‘</w:t>
+      </w:r>
+      <w:r>
+        <w:t>PCT_reserve_mapping</w:t>
+      </w:r>
+      <w:r>
+        <w:t>’</w:t>
+      </w:r>
+      <w:r>
+        <w:rPr>
+          <w:rFonts w:hint="eastAsia"/>
+        </w:rPr>
+        <w:t xml:space="preserve"> to have new columns</w:t>
+      </w:r>
+      <w:r>
+        <w:rPr>
+          <w:rFonts w:hint="eastAsia"/>
+        </w:rPr>
+        <w:t>:</w:t>
+      </w:r>
+      <w:r>
+        <w:br/>
+      </w:r>
+      <w:r>
+        <w:rPr>
+          <w:rFonts w:hint="eastAsia"/>
+          <w:lang w:val="en-US"/>
+        </w:rPr>
+        <w:t xml:space="preserve">line 32: </w:t>
+      </w:r>
+      <w:r>
+        <w:rPr>
+          <w:lang w:val="en-US"/>
+        </w:rPr>
+        <w:t>def build_reserves_import</w:t>
+      </w:r>
+      <w:r>
+        <w:rPr>
+          <w:rFonts w:hint="eastAsia"/>
+          <w:lang w:val="en-US"/>
+        </w:rPr>
+        <w:t xml:space="preserve"> function</w:t>
+      </w:r>
+    </w:p>
+    <w:p>
+      <w:pPr>
+        <w:rPr>
+          <w:lang w:val="en-US"/>
+        </w:rPr>
+      </w:pPr>
+    </w:p>
+    <w:p>
+      <w:pPr>
+        <w:rPr>
+          <w:lang w:val="en-US"/>
+        </w:rPr>
+      </w:pPr>
+      <w:r>
+        <w:rPr>
+          <w:rFonts w:hint="eastAsia"/>
+          <w:lang w:val="en-US"/>
+        </w:rPr>
+        <w:t>Modified</w:t>
+      </w:r>
+      <w:r>
+        <w:rPr>
+          <w:rFonts w:hint="eastAsia"/>
+          <w:lang w:val="en-US"/>
+        </w:rPr>
+        <w:t xml:space="preserve"> </w:t>
+      </w:r>
+      <w:r>
+        <w:rPr>
+          <w:lang w:val="en-US"/>
+        </w:rPr>
+        <w:t>‘</w:t>
+      </w:r>
+      <w:r>
+        <w:rPr>
+          <w:lang w:val="en-US"/>
+        </w:rPr>
+        <w:t>mySQL_occurrences_final</w:t>
+      </w:r>
+      <w:r>
+        <w:rPr>
+          <w:lang w:val="en-US"/>
+        </w:rPr>
+        <w:t>’</w:t>
+      </w:r>
+      <w:r>
+        <w:rPr>
+          <w:rFonts w:hint="eastAsia"/>
+          <w:lang w:val="en-US"/>
+        </w:rPr>
+        <w:t>to handle data_generalisation column properly</w:t>
+      </w:r>
+    </w:p>
+    <w:p>
+      <w:pPr>
+        <w:rPr>
+          <w:lang w:val="en-US"/>
+        </w:rPr>
+      </w:pPr>
+      <w:r>
+        <w:rPr>
+          <w:rFonts w:hint="eastAsia"/>
+          <w:lang w:val="en-US"/>
+        </w:rPr>
+        <w:t>line 94</w:t>
+      </w:r>
+    </w:p>
+    <w:p>
+      <w:pPr>
+        <w:rPr>
+          <w:lang w:val="en-US"/>
+        </w:rPr>
+      </w:pPr>
+    </w:p>
+    <w:p>
+      <w:pPr>
+        <w:pStyle w:val="ListParagraph"/>
+        <w:numPr>
+          <w:ilvl w:val="0"/>
+          <w:numId w:val="4"/>
+        </w:numPr>
+        <w:rPr>
+          <w:lang w:val="en-US"/>
+        </w:rPr>
+      </w:pPr>
+      <w:r>
+        <w:rPr>
+          <w:lang w:val="en-US"/>
+        </w:rPr>
+        <w:t>A</w:t>
+      </w:r>
+      <w:r>
+        <w:rPr>
+          <w:rFonts w:hint="eastAsia"/>
+          <w:lang w:val="en-US"/>
+        </w:rPr>
+        <w:t xml:space="preserve">fter table/code update, I had to </w:t>
+      </w:r>
+      <w:r>
+        <w:rPr>
+          <w:lang w:val="en-US"/>
+        </w:rPr>
+        <w:t>initiali</w:t>
+      </w:r>
+      <w:r>
+        <w:rPr>
+          <w:rFonts w:hint="eastAsia"/>
+          <w:lang w:val="en-US"/>
+        </w:rPr>
+        <w:t>se occurrences &amp; reserves tables to add new rows in the current table.</w:t>
+      </w:r>
+    </w:p>
+    <w:p>
+      <w:pPr>
+        <w:pStyle w:val="ListParagraph"/>
+        <w:numPr>
+          <w:ilvl w:val="0"/>
+          <w:numId w:val="5"/>
+        </w:numPr>
+        <w:rPr>
+          <w:lang w:val="en-US"/>
+        </w:rPr>
+      </w:pPr>
+      <w:r>
+        <w:rPr>
+          <w:rFonts w:hint="eastAsia"/>
+          <w:lang w:val="en-US"/>
+        </w:rPr>
+        <w:t xml:space="preserve">Run </w:t>
+      </w:r>
+      <w:r>
+        <w:rPr>
+          <w:lang w:val="en-US"/>
+        </w:rPr>
+        <w:t>‘</w:t>
+      </w:r>
+      <w:r>
+        <w:rPr>
+          <w:lang w:val="en-US"/>
+        </w:rPr>
+        <w:t>mySQL_occurrences_final</w:t>
+      </w:r>
+      <w:r>
+        <w:rPr>
+          <w:lang w:val="en-US"/>
+        </w:rPr>
+        <w:t>’</w:t>
+      </w:r>
+      <w:r>
+        <w:rPr>
+          <w:rFonts w:hint="eastAsia"/>
+          <w:lang w:val="en-US"/>
+        </w:rPr>
+        <w:t xml:space="preserve"> with the target dataset (</w:t>
+      </w:r>
+      <w:r>
+        <w:rPr>
+          <w:lang w:val="en-US"/>
+        </w:rPr>
+        <w:t>‘</w:t>
+      </w:r>
+      <w:r>
+        <w:rPr>
+          <w:lang w:val="en-US"/>
+        </w:rPr>
+        <w:t>mySQL_occurrences_final</w:t>
+      </w:r>
+      <w:r>
+        <w:rPr>
+          <w:lang w:val="en-US"/>
+        </w:rPr>
+        <w:t>’</w:t>
+      </w:r>
+      <w:r>
+        <w:rPr>
+          <w:rFonts w:hint="eastAsia"/>
+          <w:lang w:val="en-US"/>
+        </w:rPr>
+        <w:t>)</w:t>
+      </w:r>
+    </w:p>
+    <w:p>
+      <w:pPr>
+        <w:pStyle w:val="ListParagraph"/>
+        <w:numPr>
+          <w:ilvl w:val="0"/>
+          <w:numId w:val="5"/>
+        </w:numPr>
+        <w:rPr>
+          <w:lang w:val="en-US"/>
+        </w:rPr>
+      </w:pPr>
+      <w:r>
+        <w:rPr>
+          <w:rFonts w:hint="eastAsia"/>
+          <w:lang w:val="en-US"/>
+        </w:rPr>
+        <w:t xml:space="preserve">Clean up the occurrences table including FKs </w:t>
+      </w:r>
+    </w:p>
+    <w:p>
+      <w:pPr>
+        <w:pStyle w:val="ListParagraph"/>
+        <w:numPr>
+          <w:ilvl w:val="0"/>
+          <w:numId w:val="5"/>
+        </w:numPr>
+        <w:rPr>
+          <w:lang w:val="en-US"/>
+        </w:rPr>
+      </w:pPr>
+      <w:r>
+        <w:rPr>
+          <w:rFonts w:hint="eastAsia"/>
+          <w:lang w:val="en-US"/>
+        </w:rPr>
+        <w:t>Import</w:t>
+      </w:r>
+      <w:r>
+        <w:rPr>
+          <w:rFonts w:hint="eastAsia"/>
+          <w:lang w:val="en-US"/>
+        </w:rPr>
+        <w:t xml:space="preserve"> </w:t>
+      </w:r>
+      <w:r>
+        <w:rPr>
+          <w:rFonts w:hint="eastAsia"/>
+          <w:lang w:val="en-US"/>
+        </w:rPr>
+        <w:t xml:space="preserve">sql </w:t>
+      </w:r>
+      <w:r>
+        <w:rPr>
+          <w:rFonts w:hint="eastAsia"/>
+          <w:lang w:val="en-US"/>
+        </w:rPr>
+        <w:t>to the db</w:t>
+      </w:r>
+    </w:p>
+    <w:p>
+      <w:pPr>
+        <w:pStyle w:val="ListParagraph"/>
+        <w:numPr>
+          <w:ilvl w:val="0"/>
+          <w:numId w:val="5"/>
+        </w:numPr>
+        <w:rPr>
+          <w:lang w:val="en-US"/>
+        </w:rPr>
+      </w:pPr>
+      <w:r>
+        <w:rPr>
+          <w:rFonts w:hint="eastAsia"/>
+          <w:lang w:val="en-US"/>
+        </w:rPr>
+        <w:t xml:space="preserve">Run </w:t>
+      </w:r>
+      <w:r>
+        <w:rPr>
+          <w:lang w:val="en-US"/>
+        </w:rPr>
+        <w:t>‘</w:t>
+      </w:r>
+      <w:r>
+        <w:rPr>
+          <w:lang w:val="en-US"/>
+        </w:rPr>
+        <w:t>PCT_reserve_mapping</w:t>
+      </w:r>
+      <w:r>
+        <w:rPr>
+          <w:lang w:val="en-US"/>
+        </w:rPr>
+        <w:t>’</w:t>
+      </w:r>
+      <w:r>
+        <w:rPr>
+          <w:rFonts w:hint="eastAsia"/>
+          <w:lang w:val="en-US"/>
+        </w:rPr>
+        <w:t xml:space="preserve"> with the target dataset (</w:t>
+      </w:r>
+      <w:r>
+        <w:rPr>
+          <w:lang w:val="en-US"/>
+        </w:rPr>
+        <w:t>‘</w:t>
+      </w:r>
+      <w:r>
+        <w:rPr>
+          <w:lang w:val="en-US"/>
+        </w:rPr>
+        <w:t xml:space="preserve">Parks Gardens </w:t>
+      </w:r>
+      <w:r>
+        <w:rPr>
+          <w:lang w:val="en-US"/>
+        </w:rPr>
+        <w:lastRenderedPageBreak/>
+        <w:t>MD_region.shp</w:t>
+      </w:r>
+      <w:r>
+        <w:rPr>
+          <w:rFonts w:hint="eastAsia"/>
+          <w:lang w:val="en-US"/>
+        </w:rPr>
+        <w:t xml:space="preserve"> &amp; </w:t>
+      </w:r>
+      <w:r>
+        <w:rPr>
+          <w:lang w:val="en-US"/>
+        </w:rPr>
+        <w:t>2022 vegetation mapping.shp</w:t>
+      </w:r>
+      <w:r>
+        <w:rPr>
+          <w:rFonts w:hint="eastAsia"/>
+          <w:lang w:val="en-US"/>
+        </w:rPr>
+        <w:t>)</w:t>
+      </w:r>
+    </w:p>
+    <w:p>
+      <w:pPr>
+        <w:pStyle w:val="ListParagraph"/>
+        <w:numPr>
+          <w:ilvl w:val="0"/>
+          <w:numId w:val="5"/>
+        </w:numPr>
+        <w:rPr>
+          <w:lang w:val="en-US"/>
+        </w:rPr>
+      </w:pPr>
+      <w:r>
+        <w:rPr>
+          <w:lang w:val="en-US"/>
+        </w:rPr>
+        <w:t>I</w:t>
+      </w:r>
+      <w:r>
+        <w:rPr>
+          <w:rFonts w:hint="eastAsia"/>
+          <w:lang w:val="en-US"/>
+        </w:rPr>
+        <w:t>mport sql to the db (</w:t>
+      </w:r>
+      <w:r>
+        <w:t>reserves_import.csv</w:t>
+      </w:r>
+      <w:r>
+        <w:rPr>
+          <w:rFonts w:hint="eastAsia"/>
+        </w:rPr>
+        <w:t xml:space="preserve"> &amp; </w:t>
+      </w:r>
+      <w:r>
+        <w:t>pcts_import.csv</w:t>
+      </w:r>
+      <w:r>
+        <w:rPr>
+          <w:rFonts w:hint="eastAsia"/>
+        </w:rPr>
+        <w:t>)</w:t>
+      </w:r>
+    </w:p>
+    <w:p>
+      <w:pPr>
+        <w:pStyle w:val="ListParagraph"/>
+        <w:numPr>
+          <w:ilvl w:val="0"/>
+          <w:numId w:val="5"/>
+        </w:numPr>
+        <w:rPr>
+          <w:lang w:val="en-US"/>
+        </w:rPr>
+      </w:pPr>
+      <w:r>
+        <w:rPr>
+          <w:rFonts w:hint="eastAsia"/>
+          <w:lang w:val="en-US"/>
+        </w:rPr>
+        <w:t xml:space="preserve">Clean up the </w:t>
+      </w:r>
+      <w:r>
+        <w:rPr>
+          <w:lang w:val="en-US"/>
+        </w:rPr>
+        <w:t>‘</w:t>
+      </w:r>
+      <w:r>
+        <w:t>occurrence_mapping_temp</w:t>
+      </w:r>
+      <w:r>
+        <w:t>’</w:t>
+      </w:r>
+      <w:r>
+        <w:rPr>
+          <w:rFonts w:hint="eastAsia"/>
+        </w:rPr>
+        <w:t xml:space="preserve"> table and import (</w:t>
+      </w:r>
+      <w:r>
+        <w:t>occurrence_mapping_temp.csv</w:t>
+      </w:r>
+      <w:r>
+        <w:rPr>
+          <w:rFonts w:hint="eastAsia"/>
+        </w:rPr>
+        <w:t>)</w:t>
+      </w:r>
+    </w:p>
+    <w:p>
+      <w:pPr>
+        <w:pStyle w:val="ListParagraph"/>
+        <w:numPr>
+          <w:ilvl w:val="0"/>
+          <w:numId w:val="5"/>
+        </w:numPr>
+        <w:rPr>
+          <w:lang w:val="en-US"/>
+        </w:rPr>
+      </w:pPr>
+      <w:r>
+        <w:rPr>
+          <w:rFonts w:hint="eastAsia"/>
+        </w:rPr>
+        <w:t xml:space="preserve">Apply reseve/pct ids to occurrences. (sql statement is in </w:t>
+      </w:r>
+      <w:r>
+        <w:t>phpMyAdminSQL</w:t>
+      </w:r>
+      <w:r>
+        <w:rPr>
+          <w:rFonts w:hint="eastAsia"/>
+        </w:rPr>
+        <w:t>.txt)</w:t>
+      </w:r>
+      <w:r>
+        <w:br/>
+      </w:r>
+    </w:p>
+    <w:p>
+      <w:pPr>
+        <w:rPr>
+          <w:lang w:val="en-US"/>
+        </w:rPr>
+      </w:pPr>
+    </w:p>
+    <w:p>
+      <w:pPr>
+        <w:rPr>
+          <w:lang w:val="en-US"/>
+        </w:rPr>
+      </w:pPr>
+      <w:r>
+        <w:rPr>
+          <w:rFonts w:hint="eastAsia"/>
+          <w:lang w:val="en-US"/>
+        </w:rPr>
+        <w:t>Further updates?</w:t>
+      </w:r>
+      <w:r>
+        <w:rPr>
+          <w:lang w:val="en-US"/>
+        </w:rPr>
+        <w:br/>
+      </w:r>
+      <w:r>
+        <w:rPr>
+          <w:rFonts w:hint="eastAsia"/>
+          <w:lang w:val="en-US"/>
+        </w:rPr>
+        <w:t>1. Most_recent_flag column needs an update to be functional</w:t>
+      </w:r>
+    </w:p>
+    <w:p>
+      <w:pPr>
+        <w:rPr>
+          <w:rFonts w:hint="eastAsia"/>
+          <w:lang w:val="en-US"/>
+        </w:rPr>
+      </w:pPr>
+      <w:r>
+        <w:rPr>
+          <w:rFonts w:hint="eastAsia"/>
+          <w:lang w:val="en-US"/>
+        </w:rPr>
+        <w:t>2. Workflow for reserves/pcts &amp; occurrences mapping process. It is too manual work now</w:t>
+      </w:r>
+      <w:r>
+        <w:rPr>
+          <w:lang w:val="en-US"/>
+        </w:rPr>
+        <w:br/>
+      </w:r>
+      <w:r>
+        <w:rPr>
+          <w:rFonts w:hint="eastAsia"/>
+          <w:lang w:val="en-US"/>
+        </w:rPr>
+        <w:t xml:space="preserve">3. </w:t>
+      </w:r>
+      <w:r>
+        <w:rPr>
+          <w:lang w:val="en-US"/>
+        </w:rPr>
+        <w:t>R</w:t>
+      </w:r>
+      <w:r>
+        <w:rPr>
+          <w:rFonts w:hint="eastAsia"/>
+          <w:lang w:val="en-US"/>
+        </w:rPr>
+        <w:t xml:space="preserve">eserves and pcts tables may </w:t>
+      </w:r>
+      <w:r>
+        <w:rPr>
+          <w:rFonts w:hint="eastAsia"/>
+          <w:lang w:val="en-US"/>
+        </w:rPr>
+        <w:t xml:space="preserve">have duplicated contents if re-imported with the same </w:t>
+      </w:r>
+      <w:r>
+        <w:rPr>
+          <w:lang w:val="en-US"/>
+        </w:rPr>
+        <w:t>data</w:t>
+      </w:r>
+      <w:r>
+        <w:rPr>
+          <w:rFonts w:hint="eastAsia"/>
+          <w:lang w:val="en-US"/>
+        </w:rPr>
+        <w:t>set or similar dataset</w:t>
+      </w:r>
+      <w:r>
+        <w:rPr>
+          <w:rFonts w:hint="eastAsia"/>
+          <w:lang w:val="en-US"/>
+        </w:rPr>
+        <w:t xml:space="preserve"> as I have not assigned any column UNIQUE.</w:t>
+      </w:r>
+      <w:r>
+        <w:rPr>
+          <w:rFonts w:hint="eastAsia"/>
+          <w:lang w:val="en-US"/>
+        </w:rPr>
+        <w:t xml:space="preserve"> This needs to be fixed</w:t>
+      </w:r>
+      <w:r>
+        <w:rPr>
+          <w:lang w:val="en-US"/>
+        </w:rPr>
+        <w:br/>
+      </w:r>
     </w:p>
     <w:sectPr>
       <w:pgSz w:w="11906" w:h="16838"/>
@@ -1093,6 +2109,119 @@
 <file path=word/numbering.xml><?xml version="1.0" encoding="utf-8"?>
 <w:numbering xmlns:wpc="http://schemas.microsoft.com/office/word/2010/wordprocessingCanvas" xmlns:cx="http://schemas.microsoft.com/office/drawing/2014/chartex" xmlns:cx1="http://schemas.microsoft.com/office/drawing/2015/9/8/chartex" xmlns:cx2="http://schemas.microsoft.com/office/drawing/2015/10/21/chartex" xmlns:cx3="http://schemas.microsoft.com/office/drawing/2016/5/9/chartex" xmlns:cx4="http://schemas.microsoft.com/office/drawing/2016/5/10/chartex" xmlns:cx5="http://schemas.microsoft.com/office/drawing/2016/5/11/chartex" xmlns:cx6="http://schemas.microsoft.com/office/drawing/2016/5/12/chartex" xmlns:cx7="http://schemas.microsoft.com/office/drawing/2016/5/13/chartex" xmlns:cx8="http://schemas.microsoft.com/office/drawing/2016/5/14/chartex" xmlns:mc="http://schemas.openxmlformats.org/markup-compatibility/2006" xmlns:aink="http://schemas.microsoft.com/office/drawing/2016/ink" xmlns:am3d="http://schemas.microsoft.com/office/drawing/2017/model3d" xmlns:o="urn:schemas-microsoft-com:office:office" xmlns:oel="http://schemas.microsoft.com/office/2019/extlst" xmlns:r="http://schemas.openxmlformats.org/officeDocument/2006/relationships" xmlns:m="http://schemas.openxmlformats.org/officeDocument/2006/math" xmlns:v="urn:schemas-microsoft-com:vml" xmlns:wp14="http://schemas.microsoft.com/office/word/2010/wordprocessingDrawing" xmlns:wp="http://schemas.openxmlformats.org/drawingml/2006/wordprocessingDrawing" xmlns:w10="urn:schemas-microsoft-com:office:word" xmlns:w="http://schemas.openxmlformats.org/wordprocessingml/2006/main" xmlns:w14="http://schemas.microsoft.com/office/word/2010/wordml" xmlns:w15="http://schemas.microsoft.com/office/word/2012/wordml" xmlns:w16cex="http://schemas.microsoft.com/office/word/2018/wordml/cex" xmlns:w16cid="http://schemas.microsoft.com/office/word/2016/wordml/cid" xmlns:w16="http://schemas.microsoft.com/office/word/2018/wordml" xmlns:w16du="http://schemas.microsoft.com/office/word/2023/wordml/word16du" xmlns:w16sdtdh="http://schemas.microsoft.com/office/word/2020/wordml/sdtdatahash" xmlns:w16sdtfl="http://schemas.microsoft.com/office/word/2024/wordml/sdtformatlock" xmlns:w16se="http://schemas.microsoft.com/office/word/2015/wordml/symex" xmlns:wpg="http://schemas.microsoft.com/office/word/2010/wordprocessingGroup" xmlns:wpi="http://schemas.microsoft.com/office/word/2010/wordprocessingInk" xmlns:wne="http://schemas.microsoft.com/office/word/2006/wordml" xmlns:wps="http://schemas.microsoft.com/office/word/2010/wordprocessingShape" mc:Ignorable="w14 w15 w16se w16cid w16 w16cex w16sdtdh w16sdtfl w16du wp14">
   <w:abstractNum w:abstractNumId="0" w15:restartNumberingAfterBreak="0">
+    <w:nsid w:val="11093DA1"/>
+    <w:multiLevelType w:val="hybridMultilevel"/>
+    <w:tmpl w:val="F07E9804"/>
+    <w:lvl w:ilvl="0" w:tplc="1D08FD66">
+      <w:start w:val="2"/>
+      <w:numFmt w:val="bullet"/>
+      <w:lvlText w:val=""/>
+      <w:lvlJc w:val="left"/>
+      <w:pPr>
+        <w:ind w:left="800" w:hanging="360"/>
+      </w:pPr>
+      <w:rPr>
+        <w:rFonts w:ascii="Wingdings" w:eastAsiaTheme="minorEastAsia" w:hAnsi="Wingdings" w:cstheme="minorBidi" w:hint="default"/>
+      </w:rPr>
+    </w:lvl>
+    <w:lvl w:ilvl="1" w:tplc="04090003" w:tentative="1">
+      <w:start w:val="1"/>
+      <w:numFmt w:val="bullet"/>
+      <w:lvlText w:val=""/>
+      <w:lvlJc w:val="left"/>
+      <w:pPr>
+        <w:ind w:left="1320" w:hanging="440"/>
+      </w:pPr>
+      <w:rPr>
+        <w:rFonts w:ascii="Wingdings" w:hAnsi="Wingdings" w:hint="default"/>
+      </w:rPr>
+    </w:lvl>
+    <w:lvl w:ilvl="2" w:tplc="04090005" w:tentative="1">
+      <w:start w:val="1"/>
+      <w:numFmt w:val="bullet"/>
+      <w:lvlText w:val=""/>
+      <w:lvlJc w:val="left"/>
+      <w:pPr>
+        <w:ind w:left="1760" w:hanging="440"/>
+      </w:pPr>
+      <w:rPr>
+        <w:rFonts w:ascii="Wingdings" w:hAnsi="Wingdings" w:hint="default"/>
+      </w:rPr>
+    </w:lvl>
+    <w:lvl w:ilvl="3" w:tplc="04090001" w:tentative="1">
+      <w:start w:val="1"/>
+      <w:numFmt w:val="bullet"/>
+      <w:lvlText w:val=""/>
+      <w:lvlJc w:val="left"/>
+      <w:pPr>
+        <w:ind w:left="2200" w:hanging="440"/>
+      </w:pPr>
+      <w:rPr>
+        <w:rFonts w:ascii="Wingdings" w:hAnsi="Wingdings" w:hint="default"/>
+      </w:rPr>
+    </w:lvl>
+    <w:lvl w:ilvl="4" w:tplc="04090003" w:tentative="1">
+      <w:start w:val="1"/>
+      <w:numFmt w:val="bullet"/>
+      <w:lvlText w:val=""/>
+      <w:lvlJc w:val="left"/>
+      <w:pPr>
+        <w:ind w:left="2640" w:hanging="440"/>
+      </w:pPr>
+      <w:rPr>
+        <w:rFonts w:ascii="Wingdings" w:hAnsi="Wingdings" w:hint="default"/>
+      </w:rPr>
+    </w:lvl>
+    <w:lvl w:ilvl="5" w:tplc="04090005" w:tentative="1">
+      <w:start w:val="1"/>
+      <w:numFmt w:val="bullet"/>
+      <w:lvlText w:val=""/>
+      <w:lvlJc w:val="left"/>
+      <w:pPr>
+        <w:ind w:left="3080" w:hanging="440"/>
+      </w:pPr>
+      <w:rPr>
+        <w:rFonts w:ascii="Wingdings" w:hAnsi="Wingdings" w:hint="default"/>
+      </w:rPr>
+    </w:lvl>
+    <w:lvl w:ilvl="6" w:tplc="04090001" w:tentative="1">
+      <w:start w:val="1"/>
+      <w:numFmt w:val="bullet"/>
+      <w:lvlText w:val=""/>
+      <w:lvlJc w:val="left"/>
+      <w:pPr>
+        <w:ind w:left="3520" w:hanging="440"/>
+      </w:pPr>
+      <w:rPr>
+        <w:rFonts w:ascii="Wingdings" w:hAnsi="Wingdings" w:hint="default"/>
+      </w:rPr>
+    </w:lvl>
+    <w:lvl w:ilvl="7" w:tplc="04090003" w:tentative="1">
+      <w:start w:val="1"/>
+      <w:numFmt w:val="bullet"/>
+      <w:lvlText w:val=""/>
+      <w:lvlJc w:val="left"/>
+      <w:pPr>
+        <w:ind w:left="3960" w:hanging="440"/>
+      </w:pPr>
+      <w:rPr>
+        <w:rFonts w:ascii="Wingdings" w:hAnsi="Wingdings" w:hint="default"/>
+      </w:rPr>
+    </w:lvl>
+    <w:lvl w:ilvl="8" w:tplc="04090005" w:tentative="1">
+      <w:start w:val="1"/>
+      <w:numFmt w:val="bullet"/>
+      <w:lvlText w:val=""/>
+      <w:lvlJc w:val="left"/>
+      <w:pPr>
+        <w:ind w:left="4400" w:hanging="440"/>
+      </w:pPr>
+      <w:rPr>
+        <w:rFonts w:ascii="Wingdings" w:hAnsi="Wingdings" w:hint="default"/>
+      </w:rPr>
+    </w:lvl>
+  </w:abstractNum>
+  <w:abstractNum w:abstractNumId="1" w15:restartNumberingAfterBreak="0">
     <w:nsid w:val="261C35D2"/>
     <w:multiLevelType w:val="hybridMultilevel"/>
     <w:tmpl w:val="0986CF20"/>
@@ -1204,7 +2333,96 @@
       </w:rPr>
     </w:lvl>
   </w:abstractNum>
-  <w:abstractNum w:abstractNumId="1" w15:restartNumberingAfterBreak="0">
+  <w:abstractNum w:abstractNumId="2" w15:restartNumberingAfterBreak="0">
+    <w:nsid w:val="2B96516F"/>
+    <w:multiLevelType w:val="hybridMultilevel"/>
+    <w:tmpl w:val="FC76D338"/>
+    <w:lvl w:ilvl="0" w:tplc="70CE2244">
+      <w:start w:val="1"/>
+      <w:numFmt w:val="decimal"/>
+      <w:lvlText w:val="%1."/>
+      <w:lvlJc w:val="left"/>
+      <w:pPr>
+        <w:ind w:left="800" w:hanging="360"/>
+      </w:pPr>
+      <w:rPr>
+        <w:rFonts w:hint="default"/>
+      </w:rPr>
+    </w:lvl>
+    <w:lvl w:ilvl="1" w:tplc="04090019" w:tentative="1">
+      <w:start w:val="1"/>
+      <w:numFmt w:val="upperLetter"/>
+      <w:lvlText w:val="%2."/>
+      <w:lvlJc w:val="left"/>
+      <w:pPr>
+        <w:ind w:left="1320" w:hanging="440"/>
+      </w:pPr>
+    </w:lvl>
+    <w:lvl w:ilvl="2" w:tplc="0409001B" w:tentative="1">
+      <w:start w:val="1"/>
+      <w:numFmt w:val="lowerRoman"/>
+      <w:lvlText w:val="%3."/>
+      <w:lvlJc w:val="right"/>
+      <w:pPr>
+        <w:ind w:left="1760" w:hanging="440"/>
+      </w:pPr>
+    </w:lvl>
+    <w:lvl w:ilvl="3" w:tplc="0409000F" w:tentative="1">
+      <w:start w:val="1"/>
+      <w:numFmt w:val="decimal"/>
+      <w:lvlText w:val="%4."/>
+      <w:lvlJc w:val="left"/>
+      <w:pPr>
+        <w:ind w:left="2200" w:hanging="440"/>
+      </w:pPr>
+    </w:lvl>
+    <w:lvl w:ilvl="4" w:tplc="04090019" w:tentative="1">
+      <w:start w:val="1"/>
+      <w:numFmt w:val="upperLetter"/>
+      <w:lvlText w:val="%5."/>
+      <w:lvlJc w:val="left"/>
+      <w:pPr>
+        <w:ind w:left="2640" w:hanging="440"/>
+      </w:pPr>
+    </w:lvl>
+    <w:lvl w:ilvl="5" w:tplc="0409001B" w:tentative="1">
+      <w:start w:val="1"/>
+      <w:numFmt w:val="lowerRoman"/>
+      <w:lvlText w:val="%6."/>
+      <w:lvlJc w:val="right"/>
+      <w:pPr>
+        <w:ind w:left="3080" w:hanging="440"/>
+      </w:pPr>
+    </w:lvl>
+    <w:lvl w:ilvl="6" w:tplc="0409000F" w:tentative="1">
+      <w:start w:val="1"/>
+      <w:numFmt w:val="decimal"/>
+      <w:lvlText w:val="%7."/>
+      <w:lvlJc w:val="left"/>
+      <w:pPr>
+        <w:ind w:left="3520" w:hanging="440"/>
+      </w:pPr>
+    </w:lvl>
+    <w:lvl w:ilvl="7" w:tplc="04090019" w:tentative="1">
+      <w:start w:val="1"/>
+      <w:numFmt w:val="upperLetter"/>
+      <w:lvlText w:val="%8."/>
+      <w:lvlJc w:val="left"/>
+      <w:pPr>
+        <w:ind w:left="3960" w:hanging="440"/>
+      </w:pPr>
+    </w:lvl>
+    <w:lvl w:ilvl="8" w:tplc="0409001B" w:tentative="1">
+      <w:start w:val="1"/>
+      <w:numFmt w:val="lowerRoman"/>
+      <w:lvlText w:val="%9."/>
+      <w:lvlJc w:val="right"/>
+      <w:pPr>
+        <w:ind w:left="4400" w:hanging="440"/>
+      </w:pPr>
+    </w:lvl>
+  </w:abstractNum>
+  <w:abstractNum w:abstractNumId="3" w15:restartNumberingAfterBreak="0">
     <w:nsid w:val="37CF3FF1"/>
     <w:multiLevelType w:val="hybridMultilevel"/>
     <w:tmpl w:val="6D18D376"/>
@@ -1293,7 +2511,7 @@
       </w:pPr>
     </w:lvl>
   </w:abstractNum>
-  <w:abstractNum w:abstractNumId="2" w15:restartNumberingAfterBreak="0">
+  <w:abstractNum w:abstractNumId="4" w15:restartNumberingAfterBreak="0">
     <w:nsid w:val="79B32A74"/>
     <w:multiLevelType w:val="hybridMultilevel"/>
     <w:tmpl w:val="E7CC08BC"/>
@@ -1406,13 +2624,19 @@
     </w:lvl>
   </w:abstractNum>
   <w:num w:numId="1" w16cid:durableId="1572930578">
-    <w:abstractNumId w:val="2"/>
+    <w:abstractNumId w:val="4"/>
   </w:num>
   <w:num w:numId="2" w16cid:durableId="431978129">
+    <w:abstractNumId w:val="1"/>
+  </w:num>
+  <w:num w:numId="3" w16cid:durableId="873662199">
+    <w:abstractNumId w:val="3"/>
+  </w:num>
+  <w:num w:numId="4" w16cid:durableId="796753648">
     <w:abstractNumId w:val="0"/>
   </w:num>
-  <w:num w:numId="3" w16cid:durableId="873662199">
-    <w:abstractNumId w:val="1"/>
+  <w:num w:numId="5" w16cid:durableId="385298606">
+    <w:abstractNumId w:val="2"/>
   </w:num>
 </w:numbering>
 </file>
@@ -2027,7 +3251,6 @@
   <w:style w:type="character" w:default="1" w:styleId="DefaultParagraphFont">
     <w:name w:val="Default Paragraph Font"/>
     <w:uiPriority w:val="1"/>
-    <w:semiHidden/>
     <w:unhideWhenUsed/>
   </w:style>
   <w:style w:type="table" w:default="1" w:styleId="TableNormal">
@@ -2691,6 +3914,15 @@
 </file>
 
 <file path=customXml/item1.xml><?xml version="1.0" encoding="utf-8"?>
+<?mso-contentType ?>
+<FormTemplates xmlns="http://schemas.microsoft.com/sharepoint/v3/contenttype/forms">
+  <Display>DocumentLibraryForm</Display>
+  <Edit>DocumentLibraryForm</Edit>
+  <New>DocumentLibraryForm</New>
+</FormTemplates>
+</file>
+
+<file path=customXml/item2.xml><?xml version="1.0" encoding="utf-8"?>
 <p:properties xmlns:p="http://schemas.microsoft.com/office/2006/metadata/properties" xmlns:xsi="http://www.w3.org/2001/XMLSchema-instance" xmlns:pc="http://schemas.microsoft.com/office/infopath/2007/PartnerControls">
   <documentManagement>
     <TaxCatchAll xmlns="c56e763a-29c0-41b2-a4d8-e65057bbd320"/>
@@ -2699,15 +3931,6 @@
     </lcf76f155ced4ddcb4097134ff3c332f>
   </documentManagement>
 </p:properties>
-</file>
-
-<file path=customXml/item2.xml><?xml version="1.0" encoding="utf-8"?>
-<?mso-contentType ?>
-<FormTemplates xmlns="http://schemas.microsoft.com/sharepoint/v3/contenttype/forms">
-  <Display>DocumentLibraryForm</Display>
-  <Edit>DocumentLibraryForm</Edit>
-  <New>DocumentLibraryForm</New>
-</FormTemplates>
 </file>
 
 <file path=customXml/item3.xml><?xml version="1.0" encoding="utf-8"?>
@@ -2900,20 +4123,20 @@
 </file>
 
 <file path=customXml/itemProps1.xml><?xml version="1.0" encoding="utf-8"?>
+<ds:datastoreItem xmlns:ds="http://schemas.openxmlformats.org/officeDocument/2006/customXml" ds:itemID="{CB63EB43-E133-40CF-A6B4-B55BDBBBB953}">
+  <ds:schemaRefs>
+    <ds:schemaRef ds:uri="http://schemas.microsoft.com/sharepoint/v3/contenttype/forms"/>
+  </ds:schemaRefs>
+</ds:datastoreItem>
+</file>
+
+<file path=customXml/itemProps2.xml><?xml version="1.0" encoding="utf-8"?>
 <ds:datastoreItem xmlns:ds="http://schemas.openxmlformats.org/officeDocument/2006/customXml" ds:itemID="{D8622F95-4BB3-4006-BFB4-56E4FB6E8744}">
   <ds:schemaRefs>
     <ds:schemaRef ds:uri="http://schemas.microsoft.com/office/2006/metadata/properties"/>
     <ds:schemaRef ds:uri="http://schemas.microsoft.com/office/infopath/2007/PartnerControls"/>
     <ds:schemaRef ds:uri="c56e763a-29c0-41b2-a4d8-e65057bbd320"/>
     <ds:schemaRef ds:uri="81c584b5-c011-4cc6-bbc3-88da58080244"/>
-  </ds:schemaRefs>
-</ds:datastoreItem>
-</file>
-
-<file path=customXml/itemProps2.xml><?xml version="1.0" encoding="utf-8"?>
-<ds:datastoreItem xmlns:ds="http://schemas.openxmlformats.org/officeDocument/2006/customXml" ds:itemID="{CB63EB43-E133-40CF-A6B4-B55BDBBBB953}">
-  <ds:schemaRefs>
-    <ds:schemaRef ds:uri="http://schemas.microsoft.com/sharepoint/v3/contenttype/forms"/>
   </ds:schemaRefs>
 </ds:datastoreItem>
 </file>

</xml_diff>

<commit_message>
a new table 'users' is added. Updated sql statement.
</commit_message>
<xml_diff>
--- a/v0.3 DB_Observation_notes.docx
+++ b/v0.3 DB_Observation_notes.docx
@@ -1110,19 +1110,7 @@
           <w:rFonts w:hint="eastAsia"/>
         </w:rPr>
         <w:lastRenderedPageBreak/>
-        <w:t>-</w:t>
-      </w:r>
-      <w:r>
-        <w:rPr>
-          <w:rFonts w:hint="eastAsia"/>
-        </w:rPr>
-        <w:t>26</w:t>
-      </w:r>
-      <w:r>
-        <w:rPr>
-          <w:rFonts w:hint="eastAsia"/>
-        </w:rPr>
-        <w:t>/04/2026 Weekly update</w:t>
+        <w:t>-26/04/2026 Weekly update</w:t>
       </w:r>
       <w:r>
         <w:br/>
@@ -1228,16 +1216,15 @@
           <w:bCs/>
           <w:highlight w:val="yellow"/>
         </w:rPr>
-        <w:t xml:space="preserve">- geopandas.sjoin assigns </w:t>
-      </w:r>
-      <w:r>
-        <w:rPr>
-          <w:rFonts w:hint="eastAsia"/>
+        <w:t>- geopandas.sjoin assigns a polygon for each pin points</w:t>
+      </w:r>
+      <w:r>
+        <w:rPr>
           <w:b/>
           <w:bCs/>
           <w:highlight w:val="yellow"/>
         </w:rPr>
-        <w:t>a polygon</w:t>
+        <w:br/>
       </w:r>
       <w:r>
         <w:rPr>
@@ -1246,7 +1233,7 @@
           <w:bCs/>
           <w:highlight w:val="yellow"/>
         </w:rPr>
-        <w:t xml:space="preserve"> for each pin points</w:t>
+        <w:t>- than converts rows into reserve_id or pct_id</w:t>
       </w:r>
       <w:r>
         <w:rPr>
@@ -1263,34 +1250,33 @@
           <w:bCs/>
           <w:highlight w:val="yellow"/>
         </w:rPr>
-        <w:t>- than converts rows into reserve_id or pct_id</w:t>
-      </w:r>
-      <w:r>
-        <w:rPr>
+        <w:t>- finally occurrences_id / reserves_id / pct_id will come out as a result</w:t>
+      </w:r>
+    </w:p>
+    <w:p>
+      <w:pPr>
+        <w:rPr>
+          <w:b/>
+          <w:bCs/>
+        </w:rPr>
+      </w:pPr>
+      <w:r>
+        <w:rPr>
+          <w:rFonts w:hint="eastAsia"/>
           <w:b/>
           <w:bCs/>
           <w:highlight w:val="yellow"/>
         </w:rPr>
-        <w:br/>
-      </w:r>
-      <w:r>
-        <w:rPr>
-          <w:rFonts w:hint="eastAsia"/>
+        <w:t xml:space="preserve">- import this result to the db table </w:t>
+      </w:r>
+      <w:r>
+        <w:rPr>
           <w:b/>
           <w:bCs/>
           <w:highlight w:val="yellow"/>
         </w:rPr>
-        <w:t>- finally occurrences_id / reserves_id / pct_id will come out as a result</w:t>
-      </w:r>
-    </w:p>
-    <w:p>
-      <w:pPr>
-        <w:rPr>
-          <w:rFonts w:hint="eastAsia"/>
-          <w:b/>
-          <w:bCs/>
-        </w:rPr>
-      </w:pPr>
+        <w:t>‘</w:t>
+      </w:r>
       <w:r>
         <w:rPr>
           <w:rFonts w:hint="eastAsia"/>
@@ -1298,7 +1284,7 @@
           <w:bCs/>
           <w:highlight w:val="yellow"/>
         </w:rPr>
-        <w:t xml:space="preserve">- import this result to the db table </w:t>
+        <w:t>occurrence_mapping_temp</w:t>
       </w:r>
       <w:r>
         <w:rPr>
@@ -1306,7 +1292,7 @@
           <w:bCs/>
           <w:highlight w:val="yellow"/>
         </w:rPr>
-        <w:t>‘</w:t>
+        <w:t>’</w:t>
       </w:r>
       <w:r>
         <w:rPr>
@@ -1315,23 +1301,6 @@
           <w:bCs/>
           <w:highlight w:val="yellow"/>
         </w:rPr>
-        <w:t>occurrence_mapping_temp</w:t>
-      </w:r>
-      <w:r>
-        <w:rPr>
-          <w:b/>
-          <w:bCs/>
-          <w:highlight w:val="yellow"/>
-        </w:rPr>
-        <w:t>’</w:t>
-      </w:r>
-      <w:r>
-        <w:rPr>
-          <w:rFonts w:hint="eastAsia"/>
-          <w:b/>
-          <w:bCs/>
-          <w:highlight w:val="yellow"/>
-        </w:rPr>
         <w:t xml:space="preserve"> and conduct a simple sql statement in the db to update the occurrences table</w:t>
       </w:r>
     </w:p>
@@ -1386,11 +1355,6 @@
       </w:r>
     </w:p>
     <w:p>
-      <w:pPr>
-        <w:rPr>
-          <w:rFonts w:hint="eastAsia"/>
-        </w:rPr>
-      </w:pPr>
       <w:r>
         <w:rPr>
           <w:rFonts w:hint="eastAsia"/>
@@ -1437,11 +1401,6 @@
       </w:r>
     </w:p>
     <w:p>
-      <w:pPr>
-        <w:rPr>
-          <w:rFonts w:hint="eastAsia"/>
-        </w:rPr>
-      </w:pPr>
       <w:r>
         <w:rPr>
           <w:rFonts w:hint="eastAsia"/>
@@ -2018,7 +1977,6 @@
     <w:p>
       <w:pPr>
         <w:rPr>
-          <w:rFonts w:hint="eastAsia"/>
           <w:lang w:val="en-US"/>
         </w:rPr>
       </w:pPr>
@@ -2094,6 +2052,227 @@
           <w:lang w:val="en-US"/>
         </w:rPr>
         <w:br/>
+      </w:r>
+      <w:r>
+        <w:rPr>
+          <w:lang w:val="en-US"/>
+        </w:rPr>
+        <w:br/>
+      </w:r>
+      <w:r>
+        <w:rPr>
+          <w:lang w:val="en-US"/>
+        </w:rPr>
+        <w:br/>
+      </w:r>
+    </w:p>
+    <w:p>
+      <w:pPr>
+        <w:widowControl/>
+        <w:wordWrap/>
+        <w:autoSpaceDE/>
+        <w:autoSpaceDN/>
+        <w:rPr>
+          <w:lang w:val="en-US"/>
+        </w:rPr>
+      </w:pPr>
+      <w:r>
+        <w:rPr>
+          <w:lang w:val="en-US"/>
+        </w:rPr>
+        <w:br w:type="page"/>
+      </w:r>
+    </w:p>
+    <w:p>
+      <w:pPr>
+        <w:rPr>
+          <w:lang w:val="en-US"/>
+        </w:rPr>
+      </w:pPr>
+      <w:r>
+        <w:rPr>
+          <w:rFonts w:hint="eastAsia"/>
+          <w:lang w:val="en-US"/>
+        </w:rPr>
+        <w:lastRenderedPageBreak/>
+        <w:t>03/05/2026 Weekly update</w:t>
+      </w:r>
+      <w:r>
+        <w:rPr>
+          <w:lang w:val="en-US"/>
+        </w:rPr>
+        <w:br/>
+      </w:r>
+      <w:r>
+        <w:rPr>
+          <w:rFonts w:hint="eastAsia"/>
+          <w:lang w:val="en-US"/>
+        </w:rPr>
+        <w:t>-created users table in the db, so login &amp; register pages can deal with it</w:t>
+      </w:r>
+      <w:r>
+        <w:rPr>
+          <w:lang w:val="en-US"/>
+        </w:rPr>
+        <w:br/>
+      </w:r>
+      <w:r>
+        <w:rPr>
+          <w:rFonts w:hint="eastAsia"/>
+          <w:lang w:val="en-US"/>
+        </w:rPr>
+        <w:t>-inserted two different rows in users table. Please see the sql below:</w:t>
+      </w:r>
+    </w:p>
+    <w:p>
+      <w:pPr>
+        <w:rPr>
+          <w:lang w:val="en-US"/>
+        </w:rPr>
+      </w:pPr>
+      <w:r>
+        <w:rPr>
+          <w:rFonts w:hint="eastAsia"/>
+          <w:lang w:val="en-US"/>
+        </w:rPr>
+        <w:t xml:space="preserve">-the date_created column will always be </w:t>
+      </w:r>
+      <w:r>
+        <w:rPr>
+          <w:lang w:val="en-US"/>
+        </w:rPr>
+        <w:t>automatically</w:t>
+      </w:r>
+      <w:r>
+        <w:rPr>
+          <w:rFonts w:hint="eastAsia"/>
+          <w:lang w:val="en-US"/>
+        </w:rPr>
+        <w:t xml:space="preserve"> created when adding rows in users table (</w:t>
+      </w:r>
+      <w:r>
+        <w:rPr>
+          <w:lang w:val="en-US"/>
+        </w:rPr>
+        <w:t>date_created TIMESTAMP DEFAULT CURRENT_TIMESTAMP</w:t>
+      </w:r>
+      <w:r>
+        <w:rPr>
+          <w:rFonts w:hint="eastAsia"/>
+          <w:lang w:val="en-US"/>
+        </w:rPr>
+        <w:t>).</w:t>
+      </w:r>
+      <w:r>
+        <w:rPr>
+          <w:lang w:val="en-US"/>
+        </w:rPr>
+        <w:br/>
+      </w:r>
+      <w:r>
+        <w:rPr>
+          <w:lang w:val="en-US"/>
+        </w:rPr>
+        <w:br/>
+      </w:r>
+      <w:r>
+        <w:rPr>
+          <w:lang w:val="en-US"/>
+        </w:rPr>
+        <w:t>INSERT INTO users (email, password, first_name, last_name, role)</w:t>
+      </w:r>
+    </w:p>
+    <w:p>
+      <w:pPr>
+        <w:rPr>
+          <w:lang w:val="en-US"/>
+        </w:rPr>
+      </w:pPr>
+      <w:r>
+        <w:rPr>
+          <w:lang w:val="en-US"/>
+        </w:rPr>
+        <w:t>VALUES</w:t>
+      </w:r>
+    </w:p>
+    <w:p>
+      <w:pPr>
+        <w:rPr>
+          <w:lang w:val="en-US"/>
+        </w:rPr>
+      </w:pPr>
+      <w:r>
+        <w:rPr>
+          <w:lang w:val="en-US"/>
+        </w:rPr>
+        <w:t xml:space="preserve">    ('admin@example.com', 'admin123', 'Admin', 'User', 'admin'),</w:t>
+      </w:r>
+    </w:p>
+    <w:p>
+      <w:pPr>
+        <w:rPr>
+          <w:rFonts w:hint="eastAsia"/>
+          <w:lang w:val="en-US"/>
+        </w:rPr>
+      </w:pPr>
+      <w:r>
+        <w:rPr>
+          <w:lang w:val="en-US"/>
+        </w:rPr>
+        <w:t xml:space="preserve">    ('viewer@example.com', 'viewer123', 'Viewer', 'User', 'viewer')</w:t>
+      </w:r>
+      <w:r>
+        <w:rPr>
+          <w:rFonts w:hint="eastAsia"/>
+          <w:lang w:val="en-US"/>
+        </w:rPr>
+        <w:t>;</w:t>
+      </w:r>
+      <w:r>
+        <w:rPr>
+          <w:lang w:val="en-US"/>
+        </w:rPr>
+        <w:br/>
+      </w:r>
+      <w:r>
+        <w:rPr>
+          <w:lang w:val="en-US"/>
+        </w:rPr>
+        <w:drawing>
+          <wp:inline distT="0" distB="0" distL="0" distR="0" wp14:anchorId="23997029" wp14:editId="31475D1D">
+            <wp:extent cx="5731510" cy="798830"/>
+            <wp:effectExtent l="0" t="0" r="2540" b="1270"/>
+            <wp:docPr id="935117182" name="Picture 1"/>
+            <wp:cNvGraphicFramePr>
+              <a:graphicFrameLocks xmlns:a="http://schemas.openxmlformats.org/drawingml/2006/main" noChangeAspect="1"/>
+            </wp:cNvGraphicFramePr>
+            <a:graphic xmlns:a="http://schemas.openxmlformats.org/drawingml/2006/main">
+              <a:graphicData uri="http://schemas.openxmlformats.org/drawingml/2006/picture">
+                <pic:pic xmlns:pic="http://schemas.openxmlformats.org/drawingml/2006/picture">
+                  <pic:nvPicPr>
+                    <pic:cNvPr id="935117182" name=""/>
+                    <pic:cNvPicPr/>
+                  </pic:nvPicPr>
+                  <pic:blipFill>
+                    <a:blip r:embed="rId9"/>
+                    <a:stretch>
+                      <a:fillRect/>
+                    </a:stretch>
+                  </pic:blipFill>
+                  <pic:spPr>
+                    <a:xfrm>
+                      <a:off x="0" y="0"/>
+                      <a:ext cx="5731510" cy="798830"/>
+                    </a:xfrm>
+                    <a:prstGeom prst="rect">
+                      <a:avLst/>
+                    </a:prstGeom>
+                  </pic:spPr>
+                </pic:pic>
+              </a:graphicData>
+            </a:graphic>
+          </wp:inline>
+        </w:drawing>
       </w:r>
     </w:p>
     <w:sectPr>
@@ -3251,6 +3430,7 @@
   <w:style w:type="character" w:default="1" w:styleId="DefaultParagraphFont">
     <w:name w:val="Default Paragraph Font"/>
     <w:uiPriority w:val="1"/>
+    <w:semiHidden/>
     <w:unhideWhenUsed/>
   </w:style>
   <w:style w:type="table" w:default="1" w:styleId="TableNormal">
@@ -3914,15 +4094,6 @@
 </file>
 
 <file path=customXml/item1.xml><?xml version="1.0" encoding="utf-8"?>
-<?mso-contentType ?>
-<FormTemplates xmlns="http://schemas.microsoft.com/sharepoint/v3/contenttype/forms">
-  <Display>DocumentLibraryForm</Display>
-  <Edit>DocumentLibraryForm</Edit>
-  <New>DocumentLibraryForm</New>
-</FormTemplates>
-</file>
-
-<file path=customXml/item2.xml><?xml version="1.0" encoding="utf-8"?>
 <p:properties xmlns:p="http://schemas.microsoft.com/office/2006/metadata/properties" xmlns:xsi="http://www.w3.org/2001/XMLSchema-instance" xmlns:pc="http://schemas.microsoft.com/office/infopath/2007/PartnerControls">
   <documentManagement>
     <TaxCatchAll xmlns="c56e763a-29c0-41b2-a4d8-e65057bbd320"/>
@@ -3931,6 +4102,15 @@
     </lcf76f155ced4ddcb4097134ff3c332f>
   </documentManagement>
 </p:properties>
+</file>
+
+<file path=customXml/item2.xml><?xml version="1.0" encoding="utf-8"?>
+<?mso-contentType ?>
+<FormTemplates xmlns="http://schemas.microsoft.com/sharepoint/v3/contenttype/forms">
+  <Display>DocumentLibraryForm</Display>
+  <Edit>DocumentLibraryForm</Edit>
+  <New>DocumentLibraryForm</New>
+</FormTemplates>
 </file>
 
 <file path=customXml/item3.xml><?xml version="1.0" encoding="utf-8"?>
@@ -4123,20 +4303,20 @@
 </file>
 
 <file path=customXml/itemProps1.xml><?xml version="1.0" encoding="utf-8"?>
-<ds:datastoreItem xmlns:ds="http://schemas.openxmlformats.org/officeDocument/2006/customXml" ds:itemID="{CB63EB43-E133-40CF-A6B4-B55BDBBBB953}">
-  <ds:schemaRefs>
-    <ds:schemaRef ds:uri="http://schemas.microsoft.com/sharepoint/v3/contenttype/forms"/>
-  </ds:schemaRefs>
-</ds:datastoreItem>
-</file>
-
-<file path=customXml/itemProps2.xml><?xml version="1.0" encoding="utf-8"?>
 <ds:datastoreItem xmlns:ds="http://schemas.openxmlformats.org/officeDocument/2006/customXml" ds:itemID="{D8622F95-4BB3-4006-BFB4-56E4FB6E8744}">
   <ds:schemaRefs>
     <ds:schemaRef ds:uri="http://schemas.microsoft.com/office/2006/metadata/properties"/>
     <ds:schemaRef ds:uri="http://schemas.microsoft.com/office/infopath/2007/PartnerControls"/>
     <ds:schemaRef ds:uri="c56e763a-29c0-41b2-a4d8-e65057bbd320"/>
     <ds:schemaRef ds:uri="81c584b5-c011-4cc6-bbc3-88da58080244"/>
+  </ds:schemaRefs>
+</ds:datastoreItem>
+</file>
+
+<file path=customXml/itemProps2.xml><?xml version="1.0" encoding="utf-8"?>
+<ds:datastoreItem xmlns:ds="http://schemas.openxmlformats.org/officeDocument/2006/customXml" ds:itemID="{CB63EB43-E133-40CF-A6B4-B55BDBBBB953}">
+  <ds:schemaRefs>
+    <ds:schemaRef ds:uri="http://schemas.microsoft.com/sharepoint/v3/contenttype/forms"/>
   </ds:schemaRefs>
 </ds:datastoreItem>
 </file>

</xml_diff>